<commit_message>
Use template color values in writing guide and checklist
Palette now matches the proposal templates: Dark Purple 51389D, Lilac
F2EFFE, Light Grey EFF4FC, Dark Grey 888888. Guide heading styles, title
block and tables rebuilt to its own typography and table rules; section
numbering made sequential; Vibrant Purple renamed Bright Purple.

Co-Authored-By: Claude Opus 5.5 <noreply@anthropic.com>
Claude-Session: https://claude.ai/code/session_014SmHRydJLVa8K2jN5veRpq
</commit_message>
<xml_diff>
--- a/skills/proposal-structure-generator/assets/Start2_Group_Proposal_Writing_Guide.docx
+++ b/skills/proposal-structure-generator/assets/Start2_Group_Proposal_Writing_Guide.docx
@@ -64,9 +64,10 @@
         <w:rPr>
           <w:b/>
           <w:bCs/>
-          <w:color w:val="4C2E71"/>
+          <w:color w:val="374050"/>
+          <w:sz w:val="48"/>
+          <w:szCs w:val="48"/>
           <w:sz w:val="64"/>
-          <w:szCs w:val="64"/>
         </w:rPr>
         <w:t xml:space="preserve">PROPOSAL WRITING GUIDE</w:t>
       </w:r>
@@ -78,13 +79,12 @@
       </w:pPr>
       <w:r>
         <w:rPr>
-          <w:b/>
-          <w:bCs/>
+          <w:color w:val="374050"/>
+          <w:sz w:val="36"/>
+          <w:szCs w:val="36"/>
           <w:i/>
           <w:iCs/>
-          <w:color w:val="8149FA"/>
           <w:sz w:val="28"/>
-          <w:szCs w:val="28"/>
         </w:rPr>
         <w:t xml:space="preserve">Formatting and content standards for Start2 Group Asia proposals</w:t>
       </w:r>
@@ -95,6 +95,11 @@
         <w:jc w:val="center"/>
       </w:pPr>
       <w:r>
+        <w:rPr>
+          <w:color w:val="374050"/>
+          <w:sz w:val="32"/>
+          <w:szCs w:val="32"/>
+        </w:rPr>
         <w:t>As of: September 2026</w:t>
       </w:r>
     </w:p>
@@ -122,7 +127,7 @@
       <w:pPr>
         <w:pStyle w:val="Heading1"/>
         <w:keepNext/>
-        <w:spacing w:before="320" w:after="160"/>
+        <w:spacing w:before="400" w:after="240"/>
         <w:rPr>
           <w:color w:val="374050"/>
           <w:sz w:val="21"/>
@@ -133,12 +138,17 @@
         <w:rPr>
           <w:b/>
           <w:bCs/>
-          <w:color w:val="4C2E71"/>
+          <w:color w:val="51389D"/>
         </w:rPr>
         <w:lastRenderedPageBreak/>
         <w:t>1. Document Setup</w:t>
         <w:br/>
       </w:r>
+    </w:p>
+    <w:p>
+      <w:pPr>
+        <w:spacing w:after="240"/>
+      </w:pPr>
       <w:r>
         <w:rPr>
           <w:color w:val="374050"/>
@@ -152,12 +162,12 @@
       <w:tblPr>
         <w:tblW w:w="10106" w:type="dxa"/>
         <w:tblBorders>
-          <w:top w:val="single" w:sz="4" w:space="0" w:color="auto"/>
-          <w:left w:val="single" w:sz="4" w:space="0" w:color="auto"/>
-          <w:bottom w:val="single" w:sz="4" w:space="0" w:color="auto"/>
-          <w:right w:val="single" w:sz="4" w:space="0" w:color="auto"/>
-          <w:insideH w:val="single" w:sz="4" w:space="0" w:color="auto"/>
-          <w:insideV w:val="single" w:sz="4" w:space="0" w:color="auto"/>
+          <w:top w:val="nil"/>
+          <w:left w:val="nil"/>
+          <w:bottom w:val="nil"/>
+          <w:right w:val="nil"/>
+          <w:insideH w:val="single" w:sz="4" w:space="0" w:color="F2EFFE"/>
+          <w:insideV w:val="single" w:sz="4" w:space="0" w:color="F2EFFE"/>
         </w:tblBorders>
         <w:tblCellMar>
           <w:left w:w="10" w:type="dxa"/>
@@ -176,7 +186,7 @@
         <w:tc>
           <w:tcPr>
             <w:tcW w:w="3032" w:type="dxa"/>
-            <w:shd w:val="clear" w:color="auto" w:fill="4C2E71"/>
+            <w:shd w:val="clear" w:color="auto" w:fill="51389D"/>
             <w:tcMar>
               <w:top w:w="100" w:type="dxa"/>
               <w:left w:w="120" w:type="dxa"/>
@@ -201,7 +211,7 @@
         <w:tc>
           <w:tcPr>
             <w:tcW w:w="7074" w:type="dxa"/>
-            <w:shd w:val="clear" w:color="auto" w:fill="4C2E71"/>
+            <w:shd w:val="clear" w:color="auto" w:fill="51389D"/>
             <w:tcMar>
               <w:top w:w="100" w:type="dxa"/>
               <w:left w:w="120" w:type="dxa"/>
@@ -228,18 +238,20 @@
         <w:tc>
           <w:tcPr>
             <w:tcW w:w="3032" w:type="dxa"/>
-            <w:shd w:val="clear" w:color="auto" w:fill="FFFFFF"/>
-            <w:tcMar>
-              <w:top w:w="100" w:type="dxa"/>
-              <w:left w:w="120" w:type="dxa"/>
-              <w:bottom w:w="100" w:type="dxa"/>
-              <w:right w:w="120" w:type="dxa"/>
-            </w:tcMar>
-            <w:vAlign w:val="center"/>
-          </w:tcPr>
-          <w:p>
-            <w:r>
-              <w:rPr>
+            <w:shd w:val="clear" w:color="auto" w:fill="F2EFFE"/>
+            <w:tcMar>
+              <w:top w:w="100" w:type="dxa"/>
+              <w:left w:w="120" w:type="dxa"/>
+              <w:bottom w:w="100" w:type="dxa"/>
+              <w:right w:w="120" w:type="dxa"/>
+            </w:tcMar>
+            <w:vAlign w:val="center"/>
+          </w:tcPr>
+          <w:p>
+            <w:r>
+              <w:rPr>
+                <w:b/>
+                <w:bCs/>
                 <w:sz w:val="18"/>
                 <w:szCs w:val="18"/>
               </w:rPr>
@@ -274,18 +286,20 @@
         <w:tc>
           <w:tcPr>
             <w:tcW w:w="3032" w:type="dxa"/>
-            <w:shd w:val="clear" w:color="auto" w:fill="EEF3FC"/>
-            <w:tcMar>
-              <w:top w:w="100" w:type="dxa"/>
-              <w:left w:w="120" w:type="dxa"/>
-              <w:bottom w:w="100" w:type="dxa"/>
-              <w:right w:w="120" w:type="dxa"/>
-            </w:tcMar>
-            <w:vAlign w:val="center"/>
-          </w:tcPr>
-          <w:p>
-            <w:r>
-              <w:rPr>
+            <w:shd w:val="clear" w:color="auto" w:fill="F2EFFE"/>
+            <w:tcMar>
+              <w:top w:w="100" w:type="dxa"/>
+              <w:left w:w="120" w:type="dxa"/>
+              <w:bottom w:w="100" w:type="dxa"/>
+              <w:right w:w="120" w:type="dxa"/>
+            </w:tcMar>
+            <w:vAlign w:val="center"/>
+          </w:tcPr>
+          <w:p>
+            <w:r>
+              <w:rPr>
+                <w:b/>
+                <w:bCs/>
                 <w:sz w:val="18"/>
                 <w:szCs w:val="18"/>
               </w:rPr>
@@ -296,7 +310,7 @@
         <w:tc>
           <w:tcPr>
             <w:tcW w:w="7074" w:type="dxa"/>
-            <w:shd w:val="clear" w:color="auto" w:fill="EEF3FC"/>
+            <w:shd w:val="clear" w:color="auto" w:fill="FFFFFF"/>
             <w:tcMar>
               <w:top w:w="100" w:type="dxa"/>
               <w:left w:w="120" w:type="dxa"/>
@@ -320,18 +334,20 @@
         <w:tc>
           <w:tcPr>
             <w:tcW w:w="3032" w:type="dxa"/>
-            <w:shd w:val="clear" w:color="auto" w:fill="FFFFFF"/>
-            <w:tcMar>
-              <w:top w:w="100" w:type="dxa"/>
-              <w:left w:w="120" w:type="dxa"/>
-              <w:bottom w:w="100" w:type="dxa"/>
-              <w:right w:w="120" w:type="dxa"/>
-            </w:tcMar>
-            <w:vAlign w:val="center"/>
-          </w:tcPr>
-          <w:p>
-            <w:r>
-              <w:rPr>
+            <w:shd w:val="clear" w:color="auto" w:fill="F2EFFE"/>
+            <w:tcMar>
+              <w:top w:w="100" w:type="dxa"/>
+              <w:left w:w="120" w:type="dxa"/>
+              <w:bottom w:w="100" w:type="dxa"/>
+              <w:right w:w="120" w:type="dxa"/>
+            </w:tcMar>
+            <w:vAlign w:val="center"/>
+          </w:tcPr>
+          <w:p>
+            <w:r>
+              <w:rPr>
+                <w:b/>
+                <w:bCs/>
                 <w:sz w:val="18"/>
                 <w:szCs w:val="18"/>
               </w:rPr>
@@ -366,18 +382,20 @@
         <w:tc>
           <w:tcPr>
             <w:tcW w:w="3032" w:type="dxa"/>
-            <w:shd w:val="clear" w:color="auto" w:fill="EEF3FC"/>
-            <w:tcMar>
-              <w:top w:w="100" w:type="dxa"/>
-              <w:left w:w="120" w:type="dxa"/>
-              <w:bottom w:w="100" w:type="dxa"/>
-              <w:right w:w="120" w:type="dxa"/>
-            </w:tcMar>
-            <w:vAlign w:val="center"/>
-          </w:tcPr>
-          <w:p>
-            <w:r>
-              <w:rPr>
+            <w:shd w:val="clear" w:color="auto" w:fill="F2EFFE"/>
+            <w:tcMar>
+              <w:top w:w="100" w:type="dxa"/>
+              <w:left w:w="120" w:type="dxa"/>
+              <w:bottom w:w="100" w:type="dxa"/>
+              <w:right w:w="120" w:type="dxa"/>
+            </w:tcMar>
+            <w:vAlign w:val="center"/>
+          </w:tcPr>
+          <w:p>
+            <w:r>
+              <w:rPr>
+                <w:b/>
+                <w:bCs/>
                 <w:sz w:val="18"/>
                 <w:szCs w:val="18"/>
               </w:rPr>
@@ -388,7 +406,7 @@
         <w:tc>
           <w:tcPr>
             <w:tcW w:w="7074" w:type="dxa"/>
-            <w:shd w:val="clear" w:color="auto" w:fill="EEF3FC"/>
+            <w:shd w:val="clear" w:color="auto" w:fill="FFFFFF"/>
             <w:tcMar>
               <w:top w:w="100" w:type="dxa"/>
               <w:left w:w="120" w:type="dxa"/>
@@ -421,13 +439,13 @@
       <w:pPr>
         <w:pStyle w:val="Heading1"/>
         <w:keepNext/>
-        <w:spacing w:before="320" w:after="160"/>
+        <w:spacing w:before="400" w:after="240"/>
       </w:pPr>
       <w:r>
         <w:rPr>
           <w:b/>
           <w:bCs/>
-          <w:color w:val="4C2E71"/>
+          <w:color w:val="51389D"/>
         </w:rPr>
         <w:t>2. Typography</w:t>
       </w:r>
@@ -451,12 +469,12 @@
       <w:tblPr>
         <w:tblW w:w="4771" w:type="pct"/>
         <w:tblBorders>
-          <w:top w:val="single" w:sz="4" w:space="0" w:color="auto"/>
-          <w:left w:val="single" w:sz="4" w:space="0" w:color="auto"/>
-          <w:bottom w:val="single" w:sz="4" w:space="0" w:color="auto"/>
-          <w:right w:val="single" w:sz="4" w:space="0" w:color="auto"/>
-          <w:insideH w:val="single" w:sz="4" w:space="0" w:color="auto"/>
-          <w:insideV w:val="single" w:sz="4" w:space="0" w:color="auto"/>
+          <w:top w:val="nil"/>
+          <w:left w:val="nil"/>
+          <w:bottom w:val="nil"/>
+          <w:right w:val="nil"/>
+          <w:insideH w:val="single" w:sz="4" w:space="0" w:color="F2EFFE"/>
+          <w:insideV w:val="single" w:sz="4" w:space="0" w:color="F2EFFE"/>
         </w:tblBorders>
         <w:tblCellMar>
           <w:left w:w="10" w:type="dxa"/>
@@ -479,7 +497,7 @@
         <w:tc>
           <w:tcPr>
             <w:tcW w:w="1076" w:type="pct"/>
-            <w:shd w:val="clear" w:color="auto" w:fill="4C2E71"/>
+            <w:shd w:val="clear" w:color="auto" w:fill="51389D"/>
             <w:tcMar>
               <w:top w:w="100" w:type="dxa"/>
               <w:left w:w="120" w:type="dxa"/>
@@ -504,7 +522,7 @@
         <w:tc>
           <w:tcPr>
             <w:tcW w:w="785" w:type="pct"/>
-            <w:shd w:val="clear" w:color="auto" w:fill="4C2E71"/>
+            <w:shd w:val="clear" w:color="auto" w:fill="51389D"/>
             <w:tcMar>
               <w:top w:w="100" w:type="dxa"/>
               <w:left w:w="120" w:type="dxa"/>
@@ -529,7 +547,7 @@
         <w:tc>
           <w:tcPr>
             <w:tcW w:w="565" w:type="pct"/>
-            <w:shd w:val="clear" w:color="auto" w:fill="4C2E71"/>
+            <w:shd w:val="clear" w:color="auto" w:fill="51389D"/>
             <w:tcMar>
               <w:top w:w="100" w:type="dxa"/>
               <w:left w:w="120" w:type="dxa"/>
@@ -554,7 +572,7 @@
         <w:tc>
           <w:tcPr>
             <w:tcW w:w="1250" w:type="pct"/>
-            <w:shd w:val="clear" w:color="auto" w:fill="4C2E71"/>
+            <w:shd w:val="clear" w:color="auto" w:fill="51389D"/>
             <w:tcMar>
               <w:top w:w="100" w:type="dxa"/>
               <w:left w:w="120" w:type="dxa"/>
@@ -597,7 +615,7 @@
         <w:tc>
           <w:tcPr>
             <w:tcW w:w="1323" w:type="pct"/>
-            <w:shd w:val="clear" w:color="auto" w:fill="4C2E71"/>
+            <w:shd w:val="clear" w:color="auto" w:fill="51389D"/>
           </w:tcPr>
           <w:p>
             <w:pPr>
@@ -644,18 +662,20 @@
         <w:tc>
           <w:tcPr>
             <w:tcW w:w="1076" w:type="pct"/>
-            <w:shd w:val="clear" w:color="auto" w:fill="FFFFFF" w:themeFill="background1"/>
-            <w:tcMar>
-              <w:top w:w="100" w:type="dxa"/>
-              <w:left w:w="120" w:type="dxa"/>
-              <w:bottom w:w="100" w:type="dxa"/>
-              <w:right w:w="120" w:type="dxa"/>
-            </w:tcMar>
-            <w:vAlign w:val="center"/>
-          </w:tcPr>
-          <w:p>
-            <w:r>
-              <w:rPr>
+            <w:shd w:val="clear" w:color="auto" w:fill="F2EFFE" w:themeFill="background1"/>
+            <w:tcMar>
+              <w:top w:w="100" w:type="dxa"/>
+              <w:left w:w="120" w:type="dxa"/>
+              <w:bottom w:w="100" w:type="dxa"/>
+              <w:right w:w="120" w:type="dxa"/>
+            </w:tcMar>
+            <w:vAlign w:val="center"/>
+          </w:tcPr>
+          <w:p>
+            <w:r>
+              <w:rPr>
+                <w:b/>
+                <w:bCs/>
                 <w:sz w:val="18"/>
                 <w:szCs w:val="18"/>
               </w:rPr>
@@ -756,18 +776,20 @@
         <w:tc>
           <w:tcPr>
             <w:tcW w:w="1076" w:type="pct"/>
-            <w:shd w:val="clear" w:color="auto" w:fill="EEF3FC"/>
-            <w:tcMar>
-              <w:top w:w="100" w:type="dxa"/>
-              <w:left w:w="120" w:type="dxa"/>
-              <w:bottom w:w="100" w:type="dxa"/>
-              <w:right w:w="120" w:type="dxa"/>
-            </w:tcMar>
-            <w:vAlign w:val="center"/>
-          </w:tcPr>
-          <w:p>
-            <w:r>
-              <w:rPr>
+            <w:shd w:val="clear" w:color="auto" w:fill="F2EFFE"/>
+            <w:tcMar>
+              <w:top w:w="100" w:type="dxa"/>
+              <w:left w:w="120" w:type="dxa"/>
+              <w:bottom w:w="100" w:type="dxa"/>
+              <w:right w:w="120" w:type="dxa"/>
+            </w:tcMar>
+            <w:vAlign w:val="center"/>
+          </w:tcPr>
+          <w:p>
+            <w:r>
+              <w:rPr>
+                <w:b/>
+                <w:bCs/>
                 <w:sz w:val="18"/>
                 <w:szCs w:val="18"/>
               </w:rPr>
@@ -778,7 +800,7 @@
         <w:tc>
           <w:tcPr>
             <w:tcW w:w="785" w:type="pct"/>
-            <w:shd w:val="clear" w:color="auto" w:fill="EEF3FC"/>
+            <w:shd w:val="clear" w:color="auto" w:fill="FFFFFF"/>
             <w:tcMar>
               <w:top w:w="100" w:type="dxa"/>
               <w:left w:w="120" w:type="dxa"/>
@@ -800,7 +822,7 @@
         <w:tc>
           <w:tcPr>
             <w:tcW w:w="565" w:type="pct"/>
-            <w:shd w:val="clear" w:color="auto" w:fill="EEF3FC"/>
+            <w:shd w:val="clear" w:color="auto" w:fill="FFFFFF"/>
             <w:tcMar>
               <w:top w:w="100" w:type="dxa"/>
               <w:left w:w="120" w:type="dxa"/>
@@ -822,7 +844,7 @@
         <w:tc>
           <w:tcPr>
             <w:tcW w:w="1250" w:type="pct"/>
-            <w:shd w:val="clear" w:color="auto" w:fill="EEF3FC"/>
+            <w:shd w:val="clear" w:color="auto" w:fill="FFFFFF"/>
             <w:tcMar>
               <w:top w:w="100" w:type="dxa"/>
               <w:left w:w="120" w:type="dxa"/>
@@ -844,7 +866,7 @@
         <w:tc>
           <w:tcPr>
             <w:tcW w:w="1323" w:type="pct"/>
-            <w:shd w:val="clear" w:color="auto" w:fill="EEF3FC"/>
+            <w:shd w:val="clear" w:color="auto" w:fill="FFFFFF"/>
           </w:tcPr>
           <w:p>
             <w:pPr>
@@ -868,18 +890,20 @@
         <w:tc>
           <w:tcPr>
             <w:tcW w:w="1076" w:type="pct"/>
-            <w:shd w:val="clear" w:color="auto" w:fill="FFFFFF" w:themeFill="background1"/>
-            <w:tcMar>
-              <w:top w:w="100" w:type="dxa"/>
-              <w:left w:w="120" w:type="dxa"/>
-              <w:bottom w:w="100" w:type="dxa"/>
-              <w:right w:w="120" w:type="dxa"/>
-            </w:tcMar>
-            <w:vAlign w:val="center"/>
-          </w:tcPr>
-          <w:p>
-            <w:r>
-              <w:rPr>
+            <w:shd w:val="clear" w:color="auto" w:fill="F2EFFE" w:themeFill="background1"/>
+            <w:tcMar>
+              <w:top w:w="100" w:type="dxa"/>
+              <w:left w:w="120" w:type="dxa"/>
+              <w:bottom w:w="100" w:type="dxa"/>
+              <w:right w:w="120" w:type="dxa"/>
+            </w:tcMar>
+            <w:vAlign w:val="center"/>
+          </w:tcPr>
+          <w:p>
+            <w:r>
+              <w:rPr>
+                <w:b/>
+                <w:bCs/>
                 <w:sz w:val="18"/>
                 <w:szCs w:val="18"/>
               </w:rPr>
@@ -980,18 +1004,20 @@
         <w:tc>
           <w:tcPr>
             <w:tcW w:w="1076" w:type="pct"/>
-            <w:shd w:val="clear" w:color="auto" w:fill="EEF3FC"/>
-            <w:tcMar>
-              <w:top w:w="100" w:type="dxa"/>
-              <w:left w:w="120" w:type="dxa"/>
-              <w:bottom w:w="100" w:type="dxa"/>
-              <w:right w:w="120" w:type="dxa"/>
-            </w:tcMar>
-            <w:vAlign w:val="center"/>
-          </w:tcPr>
-          <w:p>
-            <w:r>
-              <w:rPr>
+            <w:shd w:val="clear" w:color="auto" w:fill="F2EFFE"/>
+            <w:tcMar>
+              <w:top w:w="100" w:type="dxa"/>
+              <w:left w:w="120" w:type="dxa"/>
+              <w:bottom w:w="100" w:type="dxa"/>
+              <w:right w:w="120" w:type="dxa"/>
+            </w:tcMar>
+            <w:vAlign w:val="center"/>
+          </w:tcPr>
+          <w:p>
+            <w:r>
+              <w:rPr>
+                <w:b/>
+                <w:bCs/>
                 <w:sz w:val="18"/>
                 <w:szCs w:val="18"/>
               </w:rPr>
@@ -1002,7 +1028,7 @@
         <w:tc>
           <w:tcPr>
             <w:tcW w:w="785" w:type="pct"/>
-            <w:shd w:val="clear" w:color="auto" w:fill="EEF3FC"/>
+            <w:shd w:val="clear" w:color="auto" w:fill="FFFFFF"/>
             <w:tcMar>
               <w:top w:w="100" w:type="dxa"/>
               <w:left w:w="120" w:type="dxa"/>
@@ -1024,7 +1050,7 @@
         <w:tc>
           <w:tcPr>
             <w:tcW w:w="565" w:type="pct"/>
-            <w:shd w:val="clear" w:color="auto" w:fill="EEF3FC"/>
+            <w:shd w:val="clear" w:color="auto" w:fill="FFFFFF"/>
             <w:tcMar>
               <w:top w:w="100" w:type="dxa"/>
               <w:left w:w="120" w:type="dxa"/>
@@ -1046,29 +1072,29 @@
         <w:tc>
           <w:tcPr>
             <w:tcW w:w="1250" w:type="pct"/>
-            <w:shd w:val="clear" w:color="auto" w:fill="EEF3FC"/>
-            <w:tcMar>
-              <w:top w:w="100" w:type="dxa"/>
-              <w:left w:w="120" w:type="dxa"/>
-              <w:bottom w:w="100" w:type="dxa"/>
-              <w:right w:w="120" w:type="dxa"/>
-            </w:tcMar>
-            <w:vAlign w:val="center"/>
-          </w:tcPr>
-          <w:p>
-            <w:r>
-              <w:rPr>
-                <w:sz w:val="18"/>
-                <w:szCs w:val="18"/>
-              </w:rPr>
-              <w:t xml:space="preserve">Dark Purple 52389D</w:t>
+            <w:shd w:val="clear" w:color="auto" w:fill="FFFFFF"/>
+            <w:tcMar>
+              <w:top w:w="100" w:type="dxa"/>
+              <w:left w:w="120" w:type="dxa"/>
+              <w:bottom w:w="100" w:type="dxa"/>
+              <w:right w:w="120" w:type="dxa"/>
+            </w:tcMar>
+            <w:vAlign w:val="center"/>
+          </w:tcPr>
+          <w:p>
+            <w:r>
+              <w:rPr>
+                <w:sz w:val="18"/>
+                <w:szCs w:val="18"/>
+              </w:rPr>
+              <w:t xml:space="preserve">Dark Purple 51389D</w:t>
             </w:r>
           </w:p>
         </w:tc>
         <w:tc>
           <w:tcPr>
             <w:tcW w:w="1323" w:type="pct"/>
-            <w:shd w:val="clear" w:color="auto" w:fill="EEF3FC"/>
+            <w:shd w:val="clear" w:color="auto" w:fill="FFFFFF"/>
           </w:tcPr>
           <w:p>
             <w:pPr>
@@ -1092,18 +1118,20 @@
         <w:tc>
           <w:tcPr>
             <w:tcW w:w="1076" w:type="pct"/>
-            <w:shd w:val="clear" w:color="auto" w:fill="FFFFFF" w:themeFill="background1"/>
-            <w:tcMar>
-              <w:top w:w="100" w:type="dxa"/>
-              <w:left w:w="120" w:type="dxa"/>
-              <w:bottom w:w="100" w:type="dxa"/>
-              <w:right w:w="120" w:type="dxa"/>
-            </w:tcMar>
-            <w:vAlign w:val="center"/>
-          </w:tcPr>
-          <w:p>
-            <w:r>
-              <w:rPr>
+            <w:shd w:val="clear" w:color="auto" w:fill="F2EFFE" w:themeFill="background1"/>
+            <w:tcMar>
+              <w:top w:w="100" w:type="dxa"/>
+              <w:left w:w="120" w:type="dxa"/>
+              <w:bottom w:w="100" w:type="dxa"/>
+              <w:right w:w="120" w:type="dxa"/>
+            </w:tcMar>
+            <w:vAlign w:val="center"/>
+          </w:tcPr>
+          <w:p>
+            <w:r>
+              <w:rPr>
+                <w:b/>
+                <w:bCs/>
                 <w:sz w:val="18"/>
                 <w:szCs w:val="18"/>
               </w:rPr>
@@ -1204,18 +1232,20 @@
         <w:tc>
           <w:tcPr>
             <w:tcW w:w="1076" w:type="pct"/>
-            <w:shd w:val="clear" w:color="auto" w:fill="EEF3FC"/>
-            <w:tcMar>
-              <w:top w:w="100" w:type="dxa"/>
-              <w:left w:w="120" w:type="dxa"/>
-              <w:bottom w:w="100" w:type="dxa"/>
-              <w:right w:w="120" w:type="dxa"/>
-            </w:tcMar>
-            <w:vAlign w:val="center"/>
-          </w:tcPr>
-          <w:p>
-            <w:r>
-              <w:rPr>
+            <w:shd w:val="clear" w:color="auto" w:fill="F2EFFE"/>
+            <w:tcMar>
+              <w:top w:w="100" w:type="dxa"/>
+              <w:left w:w="120" w:type="dxa"/>
+              <w:bottom w:w="100" w:type="dxa"/>
+              <w:right w:w="120" w:type="dxa"/>
+            </w:tcMar>
+            <w:vAlign w:val="center"/>
+          </w:tcPr>
+          <w:p>
+            <w:r>
+              <w:rPr>
+                <w:b/>
+                <w:bCs/>
                 <w:sz w:val="18"/>
                 <w:szCs w:val="18"/>
               </w:rPr>
@@ -1226,7 +1256,7 @@
         <w:tc>
           <w:tcPr>
             <w:tcW w:w="785" w:type="pct"/>
-            <w:shd w:val="clear" w:color="auto" w:fill="EEF3FC"/>
+            <w:shd w:val="clear" w:color="auto" w:fill="FFFFFF"/>
             <w:tcMar>
               <w:top w:w="100" w:type="dxa"/>
               <w:left w:w="120" w:type="dxa"/>
@@ -1248,7 +1278,7 @@
         <w:tc>
           <w:tcPr>
             <w:tcW w:w="565" w:type="pct"/>
-            <w:shd w:val="clear" w:color="auto" w:fill="EEF3FC"/>
+            <w:shd w:val="clear" w:color="auto" w:fill="FFFFFF"/>
             <w:tcMar>
               <w:top w:w="100" w:type="dxa"/>
               <w:left w:w="120" w:type="dxa"/>
@@ -1270,7 +1300,7 @@
         <w:tc>
           <w:tcPr>
             <w:tcW w:w="1250" w:type="pct"/>
-            <w:shd w:val="clear" w:color="auto" w:fill="EEF3FC"/>
+            <w:shd w:val="clear" w:color="auto" w:fill="FFFFFF"/>
             <w:tcMar>
               <w:top w:w="100" w:type="dxa"/>
               <w:left w:w="120" w:type="dxa"/>
@@ -1292,7 +1322,7 @@
         <w:tc>
           <w:tcPr>
             <w:tcW w:w="1323" w:type="pct"/>
-            <w:shd w:val="clear" w:color="auto" w:fill="EEF3FC"/>
+            <w:shd w:val="clear" w:color="auto" w:fill="FFFFFF"/>
           </w:tcPr>
           <w:p>
             <w:pPr>
@@ -1316,7 +1346,7 @@
         <w:tc>
           <w:tcPr>
             <w:tcW w:w="1076" w:type="pct"/>
-            <w:shd w:val="clear" w:color="auto" w:fill="EEF3FC"/>
+            <w:shd w:val="clear" w:color="auto" w:fill="F2EFFE"/>
             <w:tcMar>
               <w:top w:w="100" w:type="dxa"/>
               <w:left w:w="120" w:type="dxa"/>
@@ -1334,6 +1364,8 @@
             </w:pPr>
             <w:r>
               <w:rPr>
+                <w:b/>
+                <w:bCs/>
                 <w:sz w:val="18"/>
                 <w:szCs w:val="18"/>
               </w:rPr>
@@ -1344,7 +1376,7 @@
         <w:tc>
           <w:tcPr>
             <w:tcW w:w="785" w:type="pct"/>
-            <w:shd w:val="clear" w:color="auto" w:fill="EEF3FC"/>
+            <w:shd w:val="clear" w:color="auto" w:fill="FFFFFF"/>
             <w:tcMar>
               <w:top w:w="100" w:type="dxa"/>
               <w:left w:w="120" w:type="dxa"/>
@@ -1372,7 +1404,7 @@
         <w:tc>
           <w:tcPr>
             <w:tcW w:w="565" w:type="pct"/>
-            <w:shd w:val="clear" w:color="auto" w:fill="EEF3FC"/>
+            <w:shd w:val="clear" w:color="auto" w:fill="FFFFFF"/>
             <w:tcMar>
               <w:top w:w="100" w:type="dxa"/>
               <w:left w:w="120" w:type="dxa"/>
@@ -1400,7 +1432,7 @@
         <w:tc>
           <w:tcPr>
             <w:tcW w:w="1250" w:type="pct"/>
-            <w:shd w:val="clear" w:color="auto" w:fill="EEF3FC"/>
+            <w:shd w:val="clear" w:color="auto" w:fill="FFFFFF"/>
             <w:tcMar>
               <w:top w:w="100" w:type="dxa"/>
               <w:left w:w="120" w:type="dxa"/>
@@ -1428,7 +1460,7 @@
         <w:tc>
           <w:tcPr>
             <w:tcW w:w="1323" w:type="pct"/>
-            <w:shd w:val="clear" w:color="auto" w:fill="EEF3FC"/>
+            <w:shd w:val="clear" w:color="auto" w:fill="FFFFFF"/>
           </w:tcPr>
           <w:p>
             <w:pPr>
@@ -1452,18 +1484,20 @@
         <w:tc>
           <w:tcPr>
             <w:tcW w:w="1076" w:type="pct"/>
-            <w:shd w:val="clear" w:color="auto" w:fill="FFFFFF" w:themeFill="background1"/>
-            <w:tcMar>
-              <w:top w:w="100" w:type="dxa"/>
-              <w:left w:w="120" w:type="dxa"/>
-              <w:bottom w:w="100" w:type="dxa"/>
-              <w:right w:w="120" w:type="dxa"/>
-            </w:tcMar>
-            <w:vAlign w:val="center"/>
-          </w:tcPr>
-          <w:p>
-            <w:r>
-              <w:rPr>
+            <w:shd w:val="clear" w:color="auto" w:fill="F2EFFE" w:themeFill="background1"/>
+            <w:tcMar>
+              <w:top w:w="100" w:type="dxa"/>
+              <w:left w:w="120" w:type="dxa"/>
+              <w:bottom w:w="100" w:type="dxa"/>
+              <w:right w:w="120" w:type="dxa"/>
+            </w:tcMar>
+            <w:vAlign w:val="center"/>
+          </w:tcPr>
+          <w:p>
+            <w:r>
+              <w:rPr>
+                <w:b/>
+                <w:bCs/>
                 <w:sz w:val="18"/>
                 <w:szCs w:val="18"/>
               </w:rPr>
@@ -1564,18 +1598,20 @@
         <w:tc>
           <w:tcPr>
             <w:tcW w:w="1076" w:type="pct"/>
-            <w:shd w:val="clear" w:color="auto" w:fill="EEF3FC"/>
-            <w:tcMar>
-              <w:top w:w="100" w:type="dxa"/>
-              <w:left w:w="120" w:type="dxa"/>
-              <w:bottom w:w="100" w:type="dxa"/>
-              <w:right w:w="120" w:type="dxa"/>
-            </w:tcMar>
-            <w:vAlign w:val="center"/>
-          </w:tcPr>
-          <w:p>
-            <w:r>
-              <w:rPr>
+            <w:shd w:val="clear" w:color="auto" w:fill="F2EFFE"/>
+            <w:tcMar>
+              <w:top w:w="100" w:type="dxa"/>
+              <w:left w:w="120" w:type="dxa"/>
+              <w:bottom w:w="100" w:type="dxa"/>
+              <w:right w:w="120" w:type="dxa"/>
+            </w:tcMar>
+            <w:vAlign w:val="center"/>
+          </w:tcPr>
+          <w:p>
+            <w:r>
+              <w:rPr>
+                <w:b/>
+                <w:bCs/>
                 <w:sz w:val="18"/>
                 <w:szCs w:val="18"/>
               </w:rPr>
@@ -1586,7 +1622,7 @@
         <w:tc>
           <w:tcPr>
             <w:tcW w:w="785" w:type="pct"/>
-            <w:shd w:val="clear" w:color="auto" w:fill="EEF3FC"/>
+            <w:shd w:val="clear" w:color="auto" w:fill="FFFFFF"/>
             <w:tcMar>
               <w:top w:w="100" w:type="dxa"/>
               <w:left w:w="120" w:type="dxa"/>
@@ -1608,7 +1644,7 @@
         <w:tc>
           <w:tcPr>
             <w:tcW w:w="565" w:type="pct"/>
-            <w:shd w:val="clear" w:color="auto" w:fill="EEF3FC"/>
+            <w:shd w:val="clear" w:color="auto" w:fill="FFFFFF"/>
             <w:tcMar>
               <w:top w:w="100" w:type="dxa"/>
               <w:left w:w="120" w:type="dxa"/>
@@ -1630,29 +1666,29 @@
         <w:tc>
           <w:tcPr>
             <w:tcW w:w="1250" w:type="pct"/>
-            <w:shd w:val="clear" w:color="auto" w:fill="EEF3FC"/>
-            <w:tcMar>
-              <w:top w:w="100" w:type="dxa"/>
-              <w:left w:w="120" w:type="dxa"/>
-              <w:bottom w:w="100" w:type="dxa"/>
-              <w:right w:w="120" w:type="dxa"/>
-            </w:tcMar>
-            <w:vAlign w:val="center"/>
-          </w:tcPr>
-          <w:p>
-            <w:r>
-              <w:rPr>
-                <w:sz w:val="18"/>
-                <w:szCs w:val="18"/>
-              </w:rPr>
-              <w:t>Dark Grey 919191</w:t>
+            <w:shd w:val="clear" w:color="auto" w:fill="FFFFFF"/>
+            <w:tcMar>
+              <w:top w:w="100" w:type="dxa"/>
+              <w:left w:w="120" w:type="dxa"/>
+              <w:bottom w:w="100" w:type="dxa"/>
+              <w:right w:w="120" w:type="dxa"/>
+            </w:tcMar>
+            <w:vAlign w:val="center"/>
+          </w:tcPr>
+          <w:p>
+            <w:r>
+              <w:rPr>
+                <w:sz w:val="18"/>
+                <w:szCs w:val="18"/>
+              </w:rPr>
+              <w:t>Dark Grey 888888</w:t>
             </w:r>
           </w:p>
         </w:tc>
         <w:tc>
           <w:tcPr>
             <w:tcW w:w="1323" w:type="pct"/>
-            <w:shd w:val="clear" w:color="auto" w:fill="EEF3FC"/>
+            <w:shd w:val="clear" w:color="auto" w:fill="FFFFFF"/>
           </w:tcPr>
           <w:p>
             <w:pPr>
@@ -1667,7 +1703,7 @@
                 <w:sz w:val="18"/>
                 <w:szCs w:val="18"/>
               </w:rPr>
-              <w:t>Dark Grey 919191</w:t>
+              <w:t>Dark Grey 888888</w:t>
             </w:r>
           </w:p>
         </w:tc>
@@ -1676,18 +1712,20 @@
         <w:tc>
           <w:tcPr>
             <w:tcW w:w="1076" w:type="pct"/>
-            <w:shd w:val="clear" w:color="auto" w:fill="FFFFFF" w:themeFill="background1"/>
-            <w:tcMar>
-              <w:top w:w="100" w:type="dxa"/>
-              <w:left w:w="120" w:type="dxa"/>
-              <w:bottom w:w="100" w:type="dxa"/>
-              <w:right w:w="120" w:type="dxa"/>
-            </w:tcMar>
-            <w:vAlign w:val="center"/>
-          </w:tcPr>
-          <w:p>
-            <w:r>
-              <w:rPr>
+            <w:shd w:val="clear" w:color="auto" w:fill="F2EFFE" w:themeFill="background1"/>
+            <w:tcMar>
+              <w:top w:w="100" w:type="dxa"/>
+              <w:left w:w="120" w:type="dxa"/>
+              <w:bottom w:w="100" w:type="dxa"/>
+              <w:right w:w="120" w:type="dxa"/>
+            </w:tcMar>
+            <w:vAlign w:val="center"/>
+          </w:tcPr>
+          <w:p>
+            <w:r>
+              <w:rPr>
+                <w:b/>
+                <w:bCs/>
                 <w:sz w:val="18"/>
                 <w:szCs w:val="18"/>
               </w:rPr>
@@ -1789,18 +1827,20 @@
         <w:tc>
           <w:tcPr>
             <w:tcW w:w="1076" w:type="pct"/>
-            <w:shd w:val="clear" w:color="auto" w:fill="EEF3FC"/>
-            <w:tcMar>
-              <w:top w:w="100" w:type="dxa"/>
-              <w:left w:w="120" w:type="dxa"/>
-              <w:bottom w:w="100" w:type="dxa"/>
-              <w:right w:w="120" w:type="dxa"/>
-            </w:tcMar>
-            <w:vAlign w:val="center"/>
-          </w:tcPr>
-          <w:p>
-            <w:r>
-              <w:rPr>
+            <w:shd w:val="clear" w:color="auto" w:fill="F2EFFE"/>
+            <w:tcMar>
+              <w:top w:w="100" w:type="dxa"/>
+              <w:left w:w="120" w:type="dxa"/>
+              <w:bottom w:w="100" w:type="dxa"/>
+              <w:right w:w="120" w:type="dxa"/>
+            </w:tcMar>
+            <w:vAlign w:val="center"/>
+          </w:tcPr>
+          <w:p>
+            <w:r>
+              <w:rPr>
+                <w:b/>
+                <w:bCs/>
                 <w:sz w:val="18"/>
                 <w:szCs w:val="18"/>
               </w:rPr>
@@ -1811,7 +1851,7 @@
         <w:tc>
           <w:tcPr>
             <w:tcW w:w="785" w:type="pct"/>
-            <w:shd w:val="clear" w:color="auto" w:fill="EEF3FC"/>
+            <w:shd w:val="clear" w:color="auto" w:fill="FFFFFF"/>
             <w:tcMar>
               <w:top w:w="100" w:type="dxa"/>
               <w:left w:w="120" w:type="dxa"/>
@@ -1833,7 +1873,7 @@
         <w:tc>
           <w:tcPr>
             <w:tcW w:w="565" w:type="pct"/>
-            <w:shd w:val="clear" w:color="auto" w:fill="EEF3FC"/>
+            <w:shd w:val="clear" w:color="auto" w:fill="FFFFFF"/>
             <w:tcMar>
               <w:top w:w="100" w:type="dxa"/>
               <w:left w:w="120" w:type="dxa"/>
@@ -1855,7 +1895,7 @@
         <w:tc>
           <w:tcPr>
             <w:tcW w:w="1250" w:type="pct"/>
-            <w:shd w:val="clear" w:color="auto" w:fill="EEF3FC"/>
+            <w:shd w:val="clear" w:color="auto" w:fill="FFFFFF"/>
             <w:tcMar>
               <w:top w:w="100" w:type="dxa"/>
               <w:left w:w="120" w:type="dxa"/>
@@ -1877,7 +1917,7 @@
         <w:tc>
           <w:tcPr>
             <w:tcW w:w="1323" w:type="pct"/>
-            <w:shd w:val="clear" w:color="auto" w:fill="EEF3FC"/>
+            <w:shd w:val="clear" w:color="auto" w:fill="FFFFFF"/>
           </w:tcPr>
           <w:p>
             <w:pPr>
@@ -1901,18 +1941,20 @@
         <w:tc>
           <w:tcPr>
             <w:tcW w:w="1076" w:type="pct"/>
-            <w:shd w:val="clear" w:color="auto" w:fill="FFFFFF" w:themeFill="background1"/>
-            <w:tcMar>
-              <w:top w:w="100" w:type="dxa"/>
-              <w:left w:w="120" w:type="dxa"/>
-              <w:bottom w:w="100" w:type="dxa"/>
-              <w:right w:w="120" w:type="dxa"/>
-            </w:tcMar>
-            <w:vAlign w:val="center"/>
-          </w:tcPr>
-          <w:p>
-            <w:r>
-              <w:rPr>
+            <w:shd w:val="clear" w:color="auto" w:fill="F2EFFE" w:themeFill="background1"/>
+            <w:tcMar>
+              <w:top w:w="100" w:type="dxa"/>
+              <w:left w:w="120" w:type="dxa"/>
+              <w:bottom w:w="100" w:type="dxa"/>
+              <w:right w:w="120" w:type="dxa"/>
+            </w:tcMar>
+            <w:vAlign w:val="center"/>
+          </w:tcPr>
+          <w:p>
+            <w:r>
+              <w:rPr>
+                <w:b/>
+                <w:bCs/>
                 <w:sz w:val="18"/>
                 <w:szCs w:val="18"/>
               </w:rPr>
@@ -1981,7 +2023,7 @@
                 <w:sz w:val="18"/>
                 <w:szCs w:val="18"/>
               </w:rPr>
-              <w:t>Dark Grey 919191</w:t>
+              <w:t>Dark Grey 888888</w:t>
             </w:r>
           </w:p>
         </w:tc>
@@ -2003,7 +2045,7 @@
                 <w:sz w:val="18"/>
                 <w:szCs w:val="18"/>
               </w:rPr>
-              <w:t>Dark Grey 919191</w:t>
+              <w:t>Dark Grey 888888</w:t>
             </w:r>
           </w:p>
         </w:tc>
@@ -2012,18 +2054,20 @@
         <w:tc>
           <w:tcPr>
             <w:tcW w:w="1076" w:type="pct"/>
-            <w:shd w:val="clear" w:color="auto" w:fill="EEF3FC"/>
-            <w:tcMar>
-              <w:top w:w="100" w:type="dxa"/>
-              <w:left w:w="120" w:type="dxa"/>
-              <w:bottom w:w="100" w:type="dxa"/>
-              <w:right w:w="120" w:type="dxa"/>
-            </w:tcMar>
-            <w:vAlign w:val="center"/>
-          </w:tcPr>
-          <w:p>
-            <w:r>
-              <w:rPr>
+            <w:shd w:val="clear" w:color="auto" w:fill="F2EFFE"/>
+            <w:tcMar>
+              <w:top w:w="100" w:type="dxa"/>
+              <w:left w:w="120" w:type="dxa"/>
+              <w:bottom w:w="100" w:type="dxa"/>
+              <w:right w:w="120" w:type="dxa"/>
+            </w:tcMar>
+            <w:vAlign w:val="center"/>
+          </w:tcPr>
+          <w:p>
+            <w:r>
+              <w:rPr>
+                <w:b/>
+                <w:bCs/>
                 <w:sz w:val="18"/>
                 <w:szCs w:val="18"/>
               </w:rPr>
@@ -2034,7 +2078,7 @@
         <w:tc>
           <w:tcPr>
             <w:tcW w:w="785" w:type="pct"/>
-            <w:shd w:val="clear" w:color="auto" w:fill="EEF3FC"/>
+            <w:shd w:val="clear" w:color="auto" w:fill="FFFFFF"/>
             <w:tcMar>
               <w:top w:w="100" w:type="dxa"/>
               <w:left w:w="120" w:type="dxa"/>
@@ -2056,7 +2100,7 @@
         <w:tc>
           <w:tcPr>
             <w:tcW w:w="565" w:type="pct"/>
-            <w:shd w:val="clear" w:color="auto" w:fill="EEF3FC"/>
+            <w:shd w:val="clear" w:color="auto" w:fill="FFFFFF"/>
             <w:tcMar>
               <w:top w:w="100" w:type="dxa"/>
               <w:left w:w="120" w:type="dxa"/>
@@ -2078,28 +2122,28 @@
         <w:tc>
           <w:tcPr>
             <w:tcW w:w="1250" w:type="pct"/>
-            <w:shd w:val="clear" w:color="auto" w:fill="EEF3FC"/>
-            <w:tcMar>
-              <w:top w:w="100" w:type="dxa"/>
-              <w:left w:w="120" w:type="dxa"/>
-              <w:bottom w:w="100" w:type="dxa"/>
-              <w:right w:w="120" w:type="dxa"/>
-            </w:tcMar>
-          </w:tcPr>
-          <w:p>
-            <w:r>
-              <w:rPr>
-                <w:sz w:val="18"/>
-                <w:szCs w:val="18"/>
-              </w:rPr>
-              <w:t>Dark Grey 919191</w:t>
+            <w:shd w:val="clear" w:color="auto" w:fill="FFFFFF"/>
+            <w:tcMar>
+              <w:top w:w="100" w:type="dxa"/>
+              <w:left w:w="120" w:type="dxa"/>
+              <w:bottom w:w="100" w:type="dxa"/>
+              <w:right w:w="120" w:type="dxa"/>
+            </w:tcMar>
+          </w:tcPr>
+          <w:p>
+            <w:r>
+              <w:rPr>
+                <w:sz w:val="18"/>
+                <w:szCs w:val="18"/>
+              </w:rPr>
+              <w:t>Dark Grey 888888</w:t>
             </w:r>
           </w:p>
         </w:tc>
         <w:tc>
           <w:tcPr>
             <w:tcW w:w="1323" w:type="pct"/>
-            <w:shd w:val="clear" w:color="auto" w:fill="EEF3FC"/>
+            <w:shd w:val="clear" w:color="auto" w:fill="FFFFFF"/>
           </w:tcPr>
           <w:p>
             <w:pPr>
@@ -2114,7 +2158,7 @@
                 <w:sz w:val="18"/>
                 <w:szCs w:val="18"/>
               </w:rPr>
-              <w:t>Dark Grey 919191</w:t>
+              <w:t>Dark Grey 888888</w:t>
             </w:r>
           </w:p>
         </w:tc>
@@ -2123,7 +2167,7 @@
         <w:tc>
           <w:tcPr>
             <w:tcW w:w="1076" w:type="pct"/>
-            <w:shd w:val="clear" w:color="auto" w:fill="FFFFFF" w:themeFill="background1"/>
+            <w:shd w:val="clear" w:color="auto" w:fill="F2EFFE" w:themeFill="background1"/>
             <w:tcMar>
               <w:top w:w="100" w:type="dxa"/>
               <w:left w:w="120" w:type="dxa"/>
@@ -2141,6 +2185,8 @@
             </w:pPr>
             <w:r>
               <w:rPr>
+                <w:b/>
+                <w:bCs/>
                 <w:sz w:val="18"/>
                 <w:szCs w:val="18"/>
               </w:rPr>
@@ -2279,13 +2325,13 @@
       <w:pPr>
         <w:pStyle w:val="Heading1"/>
         <w:keepNext/>
-        <w:spacing w:before="320" w:after="160"/>
+        <w:spacing w:before="400" w:after="240"/>
       </w:pPr>
       <w:r>
         <w:rPr>
           <w:b/>
           <w:bCs/>
-          <w:color w:val="4C2E71"/>
+          <w:color w:val="51389D"/>
         </w:rPr>
         <w:t>3. Color Palette</w:t>
       </w:r>
@@ -2302,12 +2348,12 @@
       <w:tblPr>
         <w:tblW w:w="10106" w:type="dxa"/>
         <w:tblBorders>
-          <w:top w:val="single" w:sz="4" w:space="0" w:color="auto"/>
-          <w:left w:val="single" w:sz="4" w:space="0" w:color="auto"/>
-          <w:bottom w:val="single" w:sz="4" w:space="0" w:color="auto"/>
-          <w:right w:val="single" w:sz="4" w:space="0" w:color="auto"/>
-          <w:insideH w:val="single" w:sz="4" w:space="0" w:color="auto"/>
-          <w:insideV w:val="single" w:sz="4" w:space="0" w:color="auto"/>
+          <w:top w:val="nil"/>
+          <w:left w:val="nil"/>
+          <w:bottom w:val="nil"/>
+          <w:right w:val="nil"/>
+          <w:insideH w:val="single" w:sz="4" w:space="0" w:color="F2EFFE"/>
+          <w:insideV w:val="single" w:sz="4" w:space="0" w:color="F2EFFE"/>
         </w:tblBorders>
         <w:tblCellMar>
           <w:left w:w="10" w:type="dxa"/>
@@ -2327,7 +2373,7 @@
         <w:tc>
           <w:tcPr>
             <w:tcW w:w="2223" w:type="dxa"/>
-            <w:shd w:val="clear" w:color="auto" w:fill="4C2E71"/>
+            <w:shd w:val="clear" w:color="auto" w:fill="51389D"/>
             <w:tcMar>
               <w:top w:w="100" w:type="dxa"/>
               <w:left w:w="120" w:type="dxa"/>
@@ -2353,7 +2399,7 @@
         <w:tc>
           <w:tcPr>
             <w:tcW w:w="1819" w:type="dxa"/>
-            <w:shd w:val="clear" w:color="auto" w:fill="4C2E71"/>
+            <w:shd w:val="clear" w:color="auto" w:fill="51389D"/>
             <w:tcMar>
               <w:top w:w="100" w:type="dxa"/>
               <w:left w:w="120" w:type="dxa"/>
@@ -2378,7 +2424,7 @@
         <w:tc>
           <w:tcPr>
             <w:tcW w:w="6064" w:type="dxa"/>
-            <w:shd w:val="clear" w:color="auto" w:fill="4C2E71"/>
+            <w:shd w:val="clear" w:color="auto" w:fill="51389D"/>
             <w:tcMar>
               <w:top w:w="100" w:type="dxa"/>
               <w:left w:w="120" w:type="dxa"/>
@@ -2405,18 +2451,20 @@
         <w:tc>
           <w:tcPr>
             <w:tcW w:w="2223" w:type="dxa"/>
-            <w:shd w:val="clear" w:color="auto" w:fill="FFFFFF" w:themeFill="background1"/>
-            <w:tcMar>
-              <w:top w:w="100" w:type="dxa"/>
-              <w:left w:w="120" w:type="dxa"/>
-              <w:bottom w:w="100" w:type="dxa"/>
-              <w:right w:w="120" w:type="dxa"/>
-            </w:tcMar>
-            <w:vAlign w:val="center"/>
-          </w:tcPr>
-          <w:p>
-            <w:r>
-              <w:rPr>
+            <w:shd w:val="clear" w:color="auto" w:fill="F2EFFE" w:themeFill="background1"/>
+            <w:tcMar>
+              <w:top w:w="100" w:type="dxa"/>
+              <w:left w:w="120" w:type="dxa"/>
+              <w:bottom w:w="100" w:type="dxa"/>
+              <w:right w:w="120" w:type="dxa"/>
+            </w:tcMar>
+            <w:vAlign w:val="center"/>
+          </w:tcPr>
+          <w:p>
+            <w:r>
+              <w:rPr>
+                <w:b/>
+                <w:bCs/>
                 <w:sz w:val="18"/>
                 <w:szCs w:val="18"/>
               </w:rPr>
@@ -2427,7 +2475,7 @@
         <w:tc>
           <w:tcPr>
             <w:tcW w:w="1819" w:type="dxa"/>
-            <w:shd w:val="clear" w:color="auto" w:fill="53389E"/>
+            <w:shd w:val="clear" w:color="auto" w:fill="51389D"/>
             <w:tcMar>
               <w:top w:w="100" w:type="dxa"/>
               <w:left w:w="120" w:type="dxa"/>
@@ -2443,7 +2491,7 @@
                 <w:sz w:val="18"/>
                 <w:szCs w:val="18"/>
               </w:rPr>
-              <w:t>52389D</w:t>
+              <w:t>51389D</w:t>
             </w:r>
           </w:p>
         </w:tc>
@@ -2510,18 +2558,20 @@
         <w:tc>
           <w:tcPr>
             <w:tcW w:w="2223" w:type="dxa"/>
-            <w:shd w:val="clear" w:color="auto" w:fill="FFFFFF" w:themeFill="background1"/>
-            <w:tcMar>
-              <w:top w:w="100" w:type="dxa"/>
-              <w:left w:w="120" w:type="dxa"/>
-              <w:bottom w:w="100" w:type="dxa"/>
-              <w:right w:w="120" w:type="dxa"/>
-            </w:tcMar>
-            <w:vAlign w:val="center"/>
-          </w:tcPr>
-          <w:p>
-            <w:r>
-              <w:rPr>
+            <w:shd w:val="clear" w:color="auto" w:fill="F2EFFE" w:themeFill="background1"/>
+            <w:tcMar>
+              <w:top w:w="100" w:type="dxa"/>
+              <w:left w:w="120" w:type="dxa"/>
+              <w:bottom w:w="100" w:type="dxa"/>
+              <w:right w:w="120" w:type="dxa"/>
+            </w:tcMar>
+            <w:vAlign w:val="center"/>
+          </w:tcPr>
+          <w:p>
+            <w:r>
+              <w:rPr>
+                <w:b/>
+                <w:bCs/>
                 <w:sz w:val="18"/>
                 <w:szCs w:val="18"/>
               </w:rPr>
@@ -2532,7 +2582,7 @@
         <w:tc>
           <w:tcPr>
             <w:tcW w:w="1819" w:type="dxa"/>
-            <w:shd w:val="clear" w:color="auto" w:fill="8149FB"/>
+            <w:shd w:val="clear" w:color="auto" w:fill="8149FA"/>
             <w:tcMar>
               <w:top w:w="100" w:type="dxa"/>
               <w:left w:w="120" w:type="dxa"/>
@@ -2612,18 +2662,20 @@
         <w:tc>
           <w:tcPr>
             <w:tcW w:w="2223" w:type="dxa"/>
-            <w:shd w:val="clear" w:color="auto" w:fill="FFFFFF" w:themeFill="background1"/>
-            <w:tcMar>
-              <w:top w:w="100" w:type="dxa"/>
-              <w:left w:w="120" w:type="dxa"/>
-              <w:bottom w:w="100" w:type="dxa"/>
-              <w:right w:w="120" w:type="dxa"/>
-            </w:tcMar>
-            <w:vAlign w:val="center"/>
-          </w:tcPr>
-          <w:p>
-            <w:r>
-              <w:rPr>
+            <w:shd w:val="clear" w:color="auto" w:fill="F2EFFE" w:themeFill="background1"/>
+            <w:tcMar>
+              <w:top w:w="100" w:type="dxa"/>
+              <w:left w:w="120" w:type="dxa"/>
+              <w:bottom w:w="100" w:type="dxa"/>
+              <w:right w:w="120" w:type="dxa"/>
+            </w:tcMar>
+            <w:vAlign w:val="center"/>
+          </w:tcPr>
+          <w:p>
+            <w:r>
+              <w:rPr>
+                <w:b/>
+                <w:bCs/>
                 <w:sz w:val="18"/>
                 <w:szCs w:val="18"/>
               </w:rPr>
@@ -2649,7 +2701,7 @@
                 <w:sz w:val="18"/>
                 <w:szCs w:val="18"/>
               </w:rPr>
-              <w:t>F1EFFD</w:t>
+              <w:t>F2EFFE</w:t>
             </w:r>
           </w:p>
         </w:tc>
@@ -2713,18 +2765,20 @@
         <w:tc>
           <w:tcPr>
             <w:tcW w:w="2223" w:type="dxa"/>
-            <w:shd w:val="clear" w:color="auto" w:fill="FFFFFF" w:themeFill="background1"/>
-            <w:tcMar>
-              <w:top w:w="100" w:type="dxa"/>
-              <w:left w:w="120" w:type="dxa"/>
-              <w:bottom w:w="100" w:type="dxa"/>
-              <w:right w:w="120" w:type="dxa"/>
-            </w:tcMar>
-            <w:vAlign w:val="center"/>
-          </w:tcPr>
-          <w:p>
-            <w:r>
-              <w:rPr>
+            <w:shd w:val="clear" w:color="auto" w:fill="F2EFFE" w:themeFill="background1"/>
+            <w:tcMar>
+              <w:top w:w="100" w:type="dxa"/>
+              <w:left w:w="120" w:type="dxa"/>
+              <w:bottom w:w="100" w:type="dxa"/>
+              <w:right w:w="120" w:type="dxa"/>
+            </w:tcMar>
+            <w:vAlign w:val="center"/>
+          </w:tcPr>
+          <w:p>
+            <w:r>
+              <w:rPr>
+                <w:b/>
+                <w:bCs/>
                 <w:sz w:val="18"/>
                 <w:szCs w:val="18"/>
               </w:rPr>
@@ -2735,7 +2789,7 @@
         <w:tc>
           <w:tcPr>
             <w:tcW w:w="1819" w:type="dxa"/>
-            <w:shd w:val="clear" w:color="auto" w:fill="D2FF5A"/>
+            <w:shd w:val="clear" w:color="auto" w:fill="D1FF5B"/>
             <w:tcMar>
               <w:top w:w="100" w:type="dxa"/>
               <w:left w:w="120" w:type="dxa"/>
@@ -2814,18 +2868,20 @@
         <w:tc>
           <w:tcPr>
             <w:tcW w:w="2223" w:type="dxa"/>
-            <w:shd w:val="clear" w:color="auto" w:fill="FFFFFF" w:themeFill="background1"/>
-            <w:tcMar>
-              <w:top w:w="100" w:type="dxa"/>
-              <w:left w:w="120" w:type="dxa"/>
-              <w:bottom w:w="100" w:type="dxa"/>
-              <w:right w:w="120" w:type="dxa"/>
-            </w:tcMar>
-            <w:vAlign w:val="center"/>
-          </w:tcPr>
-          <w:p>
-            <w:r>
-              <w:rPr>
+            <w:shd w:val="clear" w:color="auto" w:fill="F2EFFE" w:themeFill="background1"/>
+            <w:tcMar>
+              <w:top w:w="100" w:type="dxa"/>
+              <w:left w:w="120" w:type="dxa"/>
+              <w:bottom w:w="100" w:type="dxa"/>
+              <w:right w:w="120" w:type="dxa"/>
+            </w:tcMar>
+            <w:vAlign w:val="center"/>
+          </w:tcPr>
+          <w:p>
+            <w:r>
+              <w:rPr>
+                <w:b/>
+                <w:bCs/>
                 <w:sz w:val="18"/>
                 <w:szCs w:val="18"/>
               </w:rPr>
@@ -2918,7 +2974,7 @@
         <w:tc>
           <w:tcPr>
             <w:tcW w:w="2223" w:type="dxa"/>
-            <w:shd w:val="clear" w:color="auto" w:fill="FFFFFF" w:themeFill="background1"/>
+            <w:shd w:val="clear" w:color="auto" w:fill="F2EFFE" w:themeFill="background1"/>
             <w:tcMar>
               <w:top w:w="100" w:type="dxa"/>
               <w:left w:w="120" w:type="dxa"/>
@@ -2936,6 +2992,8 @@
             </w:pPr>
             <w:r>
               <w:rPr>
+                <w:b/>
+                <w:bCs/>
                 <w:sz w:val="18"/>
                 <w:szCs w:val="18"/>
               </w:rPr>
@@ -2946,7 +3004,7 @@
         <w:tc>
           <w:tcPr>
             <w:tcW w:w="1819" w:type="dxa"/>
-            <w:shd w:val="clear" w:color="auto" w:fill="919191"/>
+            <w:shd w:val="clear" w:color="auto" w:fill="888888"/>
             <w:tcMar>
               <w:top w:w="100" w:type="dxa"/>
               <w:left w:w="120" w:type="dxa"/>
@@ -2968,7 +3026,7 @@
                 <w:sz w:val="18"/>
                 <w:szCs w:val="18"/>
               </w:rPr>
-              <w:t>919191</w:t>
+              <w:t>888888</w:t>
             </w:r>
           </w:p>
         </w:tc>
@@ -3038,7 +3096,7 @@
         <w:tc>
           <w:tcPr>
             <w:tcW w:w="2223" w:type="dxa"/>
-            <w:shd w:val="clear" w:color="auto" w:fill="FFFFFF" w:themeFill="background1"/>
+            <w:shd w:val="clear" w:color="auto" w:fill="F2EFFE" w:themeFill="background1"/>
             <w:tcMar>
               <w:top w:w="100" w:type="dxa"/>
               <w:left w:w="120" w:type="dxa"/>
@@ -3056,6 +3114,8 @@
             </w:pPr>
             <w:r>
               <w:rPr>
+                <w:b/>
+                <w:bCs/>
                 <w:sz w:val="18"/>
                 <w:szCs w:val="18"/>
               </w:rPr>
@@ -3088,7 +3148,7 @@
                 <w:sz w:val="18"/>
                 <w:szCs w:val="18"/>
               </w:rPr>
-              <w:t>EEF3FC</w:t>
+              <w:t>EFF4FC</w:t>
             </w:r>
           </w:p>
         </w:tc>
@@ -3161,18 +3221,20 @@
         <w:tc>
           <w:tcPr>
             <w:tcW w:w="2223" w:type="dxa"/>
-            <w:shd w:val="clear" w:color="auto" w:fill="FFFFFF" w:themeFill="background1"/>
-            <w:tcMar>
-              <w:top w:w="100" w:type="dxa"/>
-              <w:left w:w="120" w:type="dxa"/>
-              <w:bottom w:w="100" w:type="dxa"/>
-              <w:right w:w="120" w:type="dxa"/>
-            </w:tcMar>
-            <w:vAlign w:val="center"/>
-          </w:tcPr>
-          <w:p>
-            <w:r>
-              <w:rPr>
+            <w:shd w:val="clear" w:color="auto" w:fill="F2EFFE" w:themeFill="background1"/>
+            <w:tcMar>
+              <w:top w:w="100" w:type="dxa"/>
+              <w:left w:w="120" w:type="dxa"/>
+              <w:bottom w:w="100" w:type="dxa"/>
+              <w:right w:w="120" w:type="dxa"/>
+            </w:tcMar>
+            <w:vAlign w:val="center"/>
+          </w:tcPr>
+          <w:p>
+            <w:r>
+              <w:rPr>
+                <w:b/>
+                <w:bCs/>
                 <w:sz w:val="18"/>
                 <w:szCs w:val="18"/>
               </w:rPr>
@@ -3271,13 +3333,13 @@
       <w:pPr>
         <w:pStyle w:val="Heading1"/>
         <w:keepNext/>
-        <w:spacing w:before="320" w:after="160"/>
+        <w:spacing w:before="400" w:after="240"/>
       </w:pPr>
       <w:r>
         <w:rPr>
           <w:b/>
           <w:bCs/>
-          <w:color w:val="4C2E71"/>
+          <w:color w:val="51389D"/>
         </w:rPr>
         <w:t xml:space="preserve">4. Indentation and Spacing (For Documents)</w:t>
       </w:r>
@@ -3373,13 +3435,13 @@
       <w:pPr>
         <w:pStyle w:val="Heading1"/>
         <w:keepNext/>
-        <w:spacing w:before="320" w:after="160"/>
+        <w:spacing w:before="400" w:after="240"/>
       </w:pPr>
       <w:r>
         <w:rPr>
           <w:b/>
           <w:bCs/>
-          <w:color w:val="4C2E71"/>
+          <w:color w:val="51389D"/>
         </w:rPr>
         <w:t>5. Tables</w:t>
       </w:r>
@@ -3426,7 +3488,7 @@
         <w:spacing w:after="60"/>
       </w:pPr>
       <w:r>
-        <w:t xml:space="preserve">Header row: Dark Purple (52389D) fill, White bold 10pt text.</w:t>
+        <w:t xml:space="preserve">Header row: Dark Purple (51389D) fill, White bold 10pt text.</w:t>
       </w:r>
     </w:p>
     <w:p>
@@ -3454,7 +3516,7 @@
         <w:spacing w:after="60"/>
       </w:pPr>
       <w:r>
-        <w:t xml:space="preserve">Label or key column: Lilac (F1EFFD) fill, bold text. Used for the label column of label and value tables (Company Information, Compliance and Eligibility) and for the key column of data tables (RACI decisions, Track Record client, Risk description).</w:t>
+        <w:t xml:space="preserve">Label or key column: Lilac (F2EFFE) fill, bold text. Used for the label column of label and value tables (Company Information, Compliance and Eligibility) and for the key column of data tables (RACI decisions, Track Record client, Risk description).</w:t>
       </w:r>
     </w:p>
     <w:p>
@@ -3468,7 +3530,7 @@
         <w:spacing w:after="60"/>
       </w:pPr>
       <w:r>
-        <w:t xml:space="preserve">Borders: no outer borders. Inside borders thin (0.5pt or less), single, Lilac (F1EFFD). No heavy grid lines.</w:t>
+        <w:t xml:space="preserve">Borders: no outer borders. Inside borders thin (0.5pt or less), single, Lilac (F2EFFE). No heavy grid lines.</w:t>
       </w:r>
     </w:p>
     <w:p>
@@ -3569,7 +3631,7 @@
         <w:spacing w:after="60"/>
       </w:pPr>
       <w:r>
-        <w:t>Header row: Dark Purple (52389D) fill, white bold text.</w:t>
+        <w:t>Header row: Dark Purple (51389D) fill, white bold text.</w:t>
       </w:r>
     </w:p>
     <w:p>
@@ -3583,7 +3645,7 @@
         <w:spacing w:after="60"/>
       </w:pPr>
       <w:r>
-        <w:t>Body rows: alternate white and Light Grey (EEF3FC) banding.</w:t>
+        <w:t>Body rows: alternate white and Light Grey (EFF4FC) banding.</w:t>
       </w:r>
     </w:p>
     <w:p>
@@ -3641,13 +3703,13 @@
       <w:pPr>
         <w:pStyle w:val="Heading1"/>
         <w:keepNext/>
-        <w:spacing w:before="320" w:after="160"/>
+        <w:spacing w:before="400" w:after="240"/>
       </w:pPr>
       <w:r>
         <w:rPr>
           <w:b/>
           <w:bCs/>
-          <w:color w:val="4C2E71"/>
+          <w:color w:val="51389D"/>
         </w:rPr>
         <w:t>6. Cover Page</w:t>
       </w:r>
@@ -3678,13 +3740,13 @@
       <w:pPr>
         <w:pStyle w:val="Heading1"/>
         <w:keepNext/>
-        <w:spacing w:before="320" w:after="160"/>
+        <w:spacing w:before="400" w:after="240"/>
       </w:pPr>
       <w:r>
         <w:rPr>
           <w:b/>
           <w:bCs/>
-          <w:color w:val="4C2E71"/>
+          <w:color w:val="51389D"/>
         </w:rPr>
         <w:t>7. Front Matter</w:t>
       </w:r>
@@ -3799,13 +3861,13 @@
       <w:pPr>
         <w:pStyle w:val="Heading1"/>
         <w:keepNext/>
-        <w:spacing w:before="320" w:after="160"/>
+        <w:spacing w:before="400" w:after="240"/>
       </w:pPr>
       <w:r>
         <w:rPr>
           <w:b/>
           <w:bCs/>
-          <w:color w:val="4C2E71"/>
+          <w:color w:val="51389D"/>
         </w:rPr>
         <w:t>8. Core Section Structure</w:t>
       </w:r>
@@ -3814,13 +3876,13 @@
       <w:pPr>
         <w:pStyle w:val="Heading2"/>
         <w:keepNext/>
-        <w:spacing w:before="220" w:after="120"/>
+        <w:spacing w:before="360" w:after="240"/>
       </w:pPr>
       <w:r>
         <w:rPr>
           <w:b/>
           <w:bCs/>
-          <w:color w:val="8149FA"/>
+          <w:color w:val="374050"/>
         </w:rPr>
         <w:t>General Structure</w:t>
       </w:r>
@@ -3829,12 +3891,12 @@
       <w:tblPr>
         <w:tblW w:w="10106" w:type="dxa"/>
         <w:tblBorders>
-          <w:top w:val="single" w:sz="4" w:space="0" w:color="auto"/>
-          <w:left w:val="single" w:sz="4" w:space="0" w:color="auto"/>
-          <w:bottom w:val="single" w:sz="4" w:space="0" w:color="auto"/>
-          <w:right w:val="single" w:sz="4" w:space="0" w:color="auto"/>
-          <w:insideH w:val="single" w:sz="4" w:space="0" w:color="auto"/>
-          <w:insideV w:val="single" w:sz="4" w:space="0" w:color="auto"/>
+          <w:top w:val="nil"/>
+          <w:left w:val="nil"/>
+          <w:bottom w:val="nil"/>
+          <w:right w:val="nil"/>
+          <w:insideH w:val="single" w:sz="4" w:space="0" w:color="F2EFFE"/>
+          <w:insideV w:val="single" w:sz="4" w:space="0" w:color="F2EFFE"/>
         </w:tblBorders>
         <w:tblCellMar>
           <w:left w:w="10" w:type="dxa"/>
@@ -3854,7 +3916,7 @@
         <w:tc>
           <w:tcPr>
             <w:tcW w:w="2628" w:type="dxa"/>
-            <w:shd w:val="clear" w:color="auto" w:fill="4C2E71"/>
+            <w:shd w:val="clear" w:color="auto" w:fill="51389D"/>
             <w:tcMar>
               <w:top w:w="100" w:type="dxa"/>
               <w:left w:w="120" w:type="dxa"/>
@@ -3879,7 +3941,7 @@
         <w:tc>
           <w:tcPr>
             <w:tcW w:w="4042" w:type="dxa"/>
-            <w:shd w:val="clear" w:color="auto" w:fill="4C2E71"/>
+            <w:shd w:val="clear" w:color="auto" w:fill="51389D"/>
             <w:tcMar>
               <w:top w:w="100" w:type="dxa"/>
               <w:left w:w="120" w:type="dxa"/>
@@ -3904,7 +3966,7 @@
         <w:tc>
           <w:tcPr>
             <w:tcW w:w="3436" w:type="dxa"/>
-            <w:shd w:val="clear" w:color="auto" w:fill="4C2E71"/>
+            <w:shd w:val="clear" w:color="auto" w:fill="51389D"/>
             <w:tcMar>
               <w:top w:w="100" w:type="dxa"/>
               <w:left w:w="120" w:type="dxa"/>
@@ -3931,18 +3993,20 @@
         <w:tc>
           <w:tcPr>
             <w:tcW w:w="2628" w:type="dxa"/>
-            <w:shd w:val="clear" w:color="auto" w:fill="FFFFFF"/>
-            <w:tcMar>
-              <w:top w:w="100" w:type="dxa"/>
-              <w:left w:w="120" w:type="dxa"/>
-              <w:bottom w:w="100" w:type="dxa"/>
-              <w:right w:w="120" w:type="dxa"/>
-            </w:tcMar>
-            <w:vAlign w:val="center"/>
-          </w:tcPr>
-          <w:p>
-            <w:r>
-              <w:rPr>
+            <w:shd w:val="clear" w:color="auto" w:fill="F2EFFE"/>
+            <w:tcMar>
+              <w:top w:w="100" w:type="dxa"/>
+              <w:left w:w="120" w:type="dxa"/>
+              <w:bottom w:w="100" w:type="dxa"/>
+              <w:right w:w="120" w:type="dxa"/>
+            </w:tcMar>
+            <w:vAlign w:val="center"/>
+          </w:tcPr>
+          <w:p>
+            <w:r>
+              <w:rPr>
+                <w:b/>
+                <w:bCs/>
                 <w:sz w:val="18"/>
                 <w:szCs w:val="18"/>
               </w:rPr>
@@ -3999,18 +4063,20 @@
         <w:tc>
           <w:tcPr>
             <w:tcW w:w="2628" w:type="dxa"/>
-            <w:shd w:val="clear" w:color="auto" w:fill="EEF3FC"/>
-            <w:tcMar>
-              <w:top w:w="100" w:type="dxa"/>
-              <w:left w:w="120" w:type="dxa"/>
-              <w:bottom w:w="100" w:type="dxa"/>
-              <w:right w:w="120" w:type="dxa"/>
-            </w:tcMar>
-            <w:vAlign w:val="center"/>
-          </w:tcPr>
-          <w:p>
-            <w:r>
-              <w:rPr>
+            <w:shd w:val="clear" w:color="auto" w:fill="F2EFFE"/>
+            <w:tcMar>
+              <w:top w:w="100" w:type="dxa"/>
+              <w:left w:w="120" w:type="dxa"/>
+              <w:bottom w:w="100" w:type="dxa"/>
+              <w:right w:w="120" w:type="dxa"/>
+            </w:tcMar>
+            <w:vAlign w:val="center"/>
+          </w:tcPr>
+          <w:p>
+            <w:r>
+              <w:rPr>
+                <w:b/>
+                <w:bCs/>
                 <w:sz w:val="18"/>
                 <w:szCs w:val="18"/>
               </w:rPr>
@@ -4021,7 +4087,7 @@
         <w:tc>
           <w:tcPr>
             <w:tcW w:w="4042" w:type="dxa"/>
-            <w:shd w:val="clear" w:color="auto" w:fill="EEF3FC"/>
+            <w:shd w:val="clear" w:color="auto" w:fill="FFFFFF"/>
             <w:tcMar>
               <w:top w:w="100" w:type="dxa"/>
               <w:left w:w="120" w:type="dxa"/>
@@ -4043,7 +4109,7 @@
         <w:tc>
           <w:tcPr>
             <w:tcW w:w="3436" w:type="dxa"/>
-            <w:shd w:val="clear" w:color="auto" w:fill="EEF3FC"/>
+            <w:shd w:val="clear" w:color="auto" w:fill="FFFFFF"/>
             <w:tcMar>
               <w:top w:w="100" w:type="dxa"/>
               <w:left w:w="120" w:type="dxa"/>
@@ -4067,18 +4133,20 @@
         <w:tc>
           <w:tcPr>
             <w:tcW w:w="2628" w:type="dxa"/>
-            <w:shd w:val="clear" w:color="auto" w:fill="FFFFFF"/>
-            <w:tcMar>
-              <w:top w:w="100" w:type="dxa"/>
-              <w:left w:w="120" w:type="dxa"/>
-              <w:bottom w:w="100" w:type="dxa"/>
-              <w:right w:w="120" w:type="dxa"/>
-            </w:tcMar>
-            <w:vAlign w:val="center"/>
-          </w:tcPr>
-          <w:p>
-            <w:r>
-              <w:rPr>
+            <w:shd w:val="clear" w:color="auto" w:fill="F2EFFE"/>
+            <w:tcMar>
+              <w:top w:w="100" w:type="dxa"/>
+              <w:left w:w="120" w:type="dxa"/>
+              <w:bottom w:w="100" w:type="dxa"/>
+              <w:right w:w="120" w:type="dxa"/>
+            </w:tcMar>
+            <w:vAlign w:val="center"/>
+          </w:tcPr>
+          <w:p>
+            <w:r>
+              <w:rPr>
+                <w:b/>
+                <w:bCs/>
                 <w:sz w:val="18"/>
                 <w:szCs w:val="18"/>
               </w:rPr>
@@ -4135,18 +4203,20 @@
         <w:tc>
           <w:tcPr>
             <w:tcW w:w="2628" w:type="dxa"/>
-            <w:shd w:val="clear" w:color="auto" w:fill="EEF3FC"/>
-            <w:tcMar>
-              <w:top w:w="100" w:type="dxa"/>
-              <w:left w:w="120" w:type="dxa"/>
-              <w:bottom w:w="100" w:type="dxa"/>
-              <w:right w:w="120" w:type="dxa"/>
-            </w:tcMar>
-            <w:vAlign w:val="center"/>
-          </w:tcPr>
-          <w:p>
-            <w:r>
-              <w:rPr>
+            <w:shd w:val="clear" w:color="auto" w:fill="F2EFFE"/>
+            <w:tcMar>
+              <w:top w:w="100" w:type="dxa"/>
+              <w:left w:w="120" w:type="dxa"/>
+              <w:bottom w:w="100" w:type="dxa"/>
+              <w:right w:w="120" w:type="dxa"/>
+            </w:tcMar>
+            <w:vAlign w:val="center"/>
+          </w:tcPr>
+          <w:p>
+            <w:r>
+              <w:rPr>
+                <w:b/>
+                <w:bCs/>
                 <w:sz w:val="18"/>
                 <w:szCs w:val="18"/>
               </w:rPr>
@@ -4157,7 +4227,7 @@
         <w:tc>
           <w:tcPr>
             <w:tcW w:w="4042" w:type="dxa"/>
-            <w:shd w:val="clear" w:color="auto" w:fill="EEF3FC"/>
+            <w:shd w:val="clear" w:color="auto" w:fill="FFFFFF"/>
             <w:tcMar>
               <w:top w:w="100" w:type="dxa"/>
               <w:left w:w="120" w:type="dxa"/>
@@ -4179,7 +4249,7 @@
         <w:tc>
           <w:tcPr>
             <w:tcW w:w="3436" w:type="dxa"/>
-            <w:shd w:val="clear" w:color="auto" w:fill="EEF3FC"/>
+            <w:shd w:val="clear" w:color="auto" w:fill="FFFFFF"/>
             <w:tcMar>
               <w:top w:w="100" w:type="dxa"/>
               <w:left w:w="120" w:type="dxa"/>
@@ -4203,18 +4273,20 @@
         <w:tc>
           <w:tcPr>
             <w:tcW w:w="2628" w:type="dxa"/>
-            <w:shd w:val="clear" w:color="auto" w:fill="FFFFFF"/>
-            <w:tcMar>
-              <w:top w:w="100" w:type="dxa"/>
-              <w:left w:w="120" w:type="dxa"/>
-              <w:bottom w:w="100" w:type="dxa"/>
-              <w:right w:w="120" w:type="dxa"/>
-            </w:tcMar>
-            <w:vAlign w:val="center"/>
-          </w:tcPr>
-          <w:p>
-            <w:r>
-              <w:rPr>
+            <w:shd w:val="clear" w:color="auto" w:fill="F2EFFE"/>
+            <w:tcMar>
+              <w:top w:w="100" w:type="dxa"/>
+              <w:left w:w="120" w:type="dxa"/>
+              <w:bottom w:w="100" w:type="dxa"/>
+              <w:right w:w="120" w:type="dxa"/>
+            </w:tcMar>
+            <w:vAlign w:val="center"/>
+          </w:tcPr>
+          <w:p>
+            <w:r>
+              <w:rPr>
+                <w:b/>
+                <w:bCs/>
                 <w:sz w:val="18"/>
                 <w:szCs w:val="18"/>
               </w:rPr>
@@ -4288,15 +4360,15 @@
       <w:pPr>
         <w:pStyle w:val="Heading1"/>
         <w:keepNext/>
-        <w:spacing w:before="320" w:after="160"/>
+        <w:spacing w:before="400" w:after="240"/>
       </w:pPr>
       <w:r>
         <w:rPr>
           <w:b/>
           <w:bCs/>
-          <w:color w:val="4C2E71"/>
+          <w:color w:val="51389D"/>
         </w:rPr>
-        <w:t>10. Visual Elements</w:t>
+        <w:t>9. Visual Elements</w:t>
       </w:r>
     </w:p>
     <w:p>
@@ -4338,7 +4410,7 @@
         <w:spacing w:after="60"/>
       </w:pPr>
       <w:r>
-        <w:t>Icons: single color, Dark Purple or Vibrant Purple, consistent stroke weight.</w:t>
+        <w:t>Icons: single color, Dark Purple or Bright Purple, consistent stroke weight.</w:t>
       </w:r>
     </w:p>
     <w:p>
@@ -4352,7 +4424,7 @@
         <w:spacing w:after="60"/>
       </w:pPr>
       <w:r>
-        <w:t>Callout boxes: Vibrant Purple left bar, Light Grey fill, no other borders.</w:t>
+        <w:t>Callout boxes: Bright Purple left bar, Light Grey fill, no other borders.</w:t>
       </w:r>
     </w:p>
     <w:p>
@@ -4367,15 +4439,15 @@
       <w:pPr>
         <w:pStyle w:val="Heading1"/>
         <w:keepNext/>
-        <w:spacing w:before="320" w:after="160"/>
+        <w:spacing w:before="400" w:after="240"/>
       </w:pPr>
       <w:r>
         <w:rPr>
           <w:b/>
           <w:bCs/>
-          <w:color w:val="4C2E71"/>
+          <w:color w:val="51389D"/>
         </w:rPr>
-        <w:t>12. Version Control</w:t>
+        <w:t>10. Version Control</w:t>
       </w:r>
     </w:p>
     <w:p>
@@ -4396,12 +4468,12 @@
       <w:tblPr>
         <w:tblW w:w="10106" w:type="dxa"/>
         <w:tblBorders>
-          <w:top w:val="single" w:sz="4" w:space="0" w:color="auto"/>
-          <w:left w:val="single" w:sz="4" w:space="0" w:color="auto"/>
-          <w:bottom w:val="single" w:sz="4" w:space="0" w:color="auto"/>
-          <w:right w:val="single" w:sz="4" w:space="0" w:color="auto"/>
-          <w:insideH w:val="single" w:sz="4" w:space="0" w:color="auto"/>
-          <w:insideV w:val="single" w:sz="4" w:space="0" w:color="auto"/>
+          <w:top w:val="nil"/>
+          <w:left w:val="nil"/>
+          <w:bottom w:val="nil"/>
+          <w:right w:val="nil"/>
+          <w:insideH w:val="single" w:sz="4" w:space="0" w:color="F2EFFE"/>
+          <w:insideV w:val="single" w:sz="4" w:space="0" w:color="F2EFFE"/>
         </w:tblBorders>
         <w:tblCellMar>
           <w:left w:w="10" w:type="dxa"/>
@@ -4422,7 +4494,7 @@
         <w:tc>
           <w:tcPr>
             <w:tcW w:w="1516" w:type="dxa"/>
-            <w:shd w:val="clear" w:color="auto" w:fill="4C2E71"/>
+            <w:shd w:val="clear" w:color="auto" w:fill="51389D"/>
             <w:tcMar>
               <w:top w:w="100" w:type="dxa"/>
               <w:left w:w="120" w:type="dxa"/>
@@ -4447,7 +4519,7 @@
         <w:tc>
           <w:tcPr>
             <w:tcW w:w="2021" w:type="dxa"/>
-            <w:shd w:val="clear" w:color="auto" w:fill="4C2E71"/>
+            <w:shd w:val="clear" w:color="auto" w:fill="51389D"/>
             <w:tcMar>
               <w:top w:w="100" w:type="dxa"/>
               <w:left w:w="120" w:type="dxa"/>
@@ -4472,7 +4544,7 @@
         <w:tc>
           <w:tcPr>
             <w:tcW w:w="2527" w:type="dxa"/>
-            <w:shd w:val="clear" w:color="auto" w:fill="4C2E71"/>
+            <w:shd w:val="clear" w:color="auto" w:fill="51389D"/>
             <w:tcMar>
               <w:top w:w="100" w:type="dxa"/>
               <w:left w:w="120" w:type="dxa"/>
@@ -4497,7 +4569,7 @@
         <w:tc>
           <w:tcPr>
             <w:tcW w:w="4042" w:type="dxa"/>
-            <w:shd w:val="clear" w:color="auto" w:fill="4C2E71"/>
+            <w:shd w:val="clear" w:color="auto" w:fill="51389D"/>
             <w:tcMar>
               <w:top w:w="100" w:type="dxa"/>
               <w:left w:w="120" w:type="dxa"/>
@@ -4524,18 +4596,20 @@
         <w:tc>
           <w:tcPr>
             <w:tcW w:w="1516" w:type="dxa"/>
-            <w:shd w:val="clear" w:color="auto" w:fill="FFFFFF"/>
-            <w:tcMar>
-              <w:top w:w="100" w:type="dxa"/>
-              <w:left w:w="120" w:type="dxa"/>
-              <w:bottom w:w="100" w:type="dxa"/>
-              <w:right w:w="120" w:type="dxa"/>
-            </w:tcMar>
-            <w:vAlign w:val="center"/>
-          </w:tcPr>
-          <w:p>
-            <w:r>
-              <w:rPr>
+            <w:shd w:val="clear" w:color="auto" w:fill="F2EFFE"/>
+            <w:tcMar>
+              <w:top w:w="100" w:type="dxa"/>
+              <w:left w:w="120" w:type="dxa"/>
+              <w:bottom w:w="100" w:type="dxa"/>
+              <w:right w:w="120" w:type="dxa"/>
+            </w:tcMar>
+            <w:vAlign w:val="center"/>
+          </w:tcPr>
+          <w:p>
+            <w:r>
+              <w:rPr>
+                <w:b/>
+                <w:bCs/>
                 <w:sz w:val="18"/>
                 <w:szCs w:val="18"/>
               </w:rPr>
@@ -4598,18 +4672,20 @@
         <w:tc>
           <w:tcPr>
             <w:tcW w:w="1516" w:type="dxa"/>
-            <w:shd w:val="clear" w:color="auto" w:fill="EEF3FC"/>
-            <w:tcMar>
-              <w:top w:w="100" w:type="dxa"/>
-              <w:left w:w="120" w:type="dxa"/>
-              <w:bottom w:w="100" w:type="dxa"/>
-              <w:right w:w="120" w:type="dxa"/>
-            </w:tcMar>
-            <w:vAlign w:val="center"/>
-          </w:tcPr>
-          <w:p>
-            <w:r>
-              <w:rPr>
+            <w:shd w:val="clear" w:color="auto" w:fill="F2EFFE"/>
+            <w:tcMar>
+              <w:top w:w="100" w:type="dxa"/>
+              <w:left w:w="120" w:type="dxa"/>
+              <w:bottom w:w="100" w:type="dxa"/>
+              <w:right w:w="120" w:type="dxa"/>
+            </w:tcMar>
+            <w:vAlign w:val="center"/>
+          </w:tcPr>
+          <w:p>
+            <w:r>
+              <w:rPr>
+                <w:b/>
+                <w:bCs/>
                 <w:sz w:val="18"/>
                 <w:szCs w:val="18"/>
               </w:rPr>
@@ -4620,7 +4696,7 @@
         <w:tc>
           <w:tcPr>
             <w:tcW w:w="2021" w:type="dxa"/>
-            <w:shd w:val="clear" w:color="auto" w:fill="EEF3FC"/>
+            <w:shd w:val="clear" w:color="auto" w:fill="FFFFFF"/>
             <w:tcMar>
               <w:top w:w="100" w:type="dxa"/>
               <w:left w:w="120" w:type="dxa"/>
@@ -4634,7 +4710,7 @@
         <w:tc>
           <w:tcPr>
             <w:tcW w:w="2527" w:type="dxa"/>
-            <w:shd w:val="clear" w:color="auto" w:fill="EEF3FC"/>
+            <w:shd w:val="clear" w:color="auto" w:fill="FFFFFF"/>
             <w:tcMar>
               <w:top w:w="100" w:type="dxa"/>
               <w:left w:w="120" w:type="dxa"/>
@@ -4648,7 +4724,7 @@
         <w:tc>
           <w:tcPr>
             <w:tcW w:w="4042" w:type="dxa"/>
-            <w:shd w:val="clear" w:color="auto" w:fill="EEF3FC"/>
+            <w:shd w:val="clear" w:color="auto" w:fill="FFFFFF"/>
             <w:tcMar>
               <w:top w:w="100" w:type="dxa"/>
               <w:left w:w="120" w:type="dxa"/>
@@ -4681,15 +4757,15 @@
       <w:pPr>
         <w:pStyle w:val="Heading1"/>
         <w:keepNext/>
-        <w:spacing w:before="320" w:after="160"/>
+        <w:spacing w:before="400" w:after="240"/>
       </w:pPr>
       <w:r>
         <w:rPr>
           <w:b/>
           <w:bCs/>
-          <w:color w:val="4C2E71"/>
+          <w:color w:val="51389D"/>
         </w:rPr>
-        <w:t>13. Content and Naming Rules</w:t>
+        <w:t>11. Content and Naming Rules</w:t>
       </w:r>
     </w:p>
     <w:p>
@@ -4704,12 +4780,12 @@
       <w:tblPr>
         <w:tblW w:w="10106" w:type="dxa"/>
         <w:tblBorders>
-          <w:top w:val="single" w:sz="4" w:space="0" w:color="auto"/>
-          <w:left w:val="single" w:sz="4" w:space="0" w:color="auto"/>
-          <w:bottom w:val="single" w:sz="4" w:space="0" w:color="auto"/>
-          <w:right w:val="single" w:sz="4" w:space="0" w:color="auto"/>
-          <w:insideH w:val="single" w:sz="4" w:space="0" w:color="auto"/>
-          <w:insideV w:val="single" w:sz="4" w:space="0" w:color="auto"/>
+          <w:top w:val="nil"/>
+          <w:left w:val="nil"/>
+          <w:bottom w:val="nil"/>
+          <w:right w:val="nil"/>
+          <w:insideH w:val="single" w:sz="4" w:space="0" w:color="F2EFFE"/>
+          <w:insideV w:val="single" w:sz="4" w:space="0" w:color="F2EFFE"/>
         </w:tblBorders>
         <w:tblCellMar>
           <w:left w:w="10" w:type="dxa"/>
@@ -4729,7 +4805,7 @@
         <w:tc>
           <w:tcPr>
             <w:tcW w:w="2426" w:type="dxa"/>
-            <w:shd w:val="clear" w:color="auto" w:fill="4C2E71"/>
+            <w:shd w:val="clear" w:color="auto" w:fill="51389D"/>
             <w:tcMar>
               <w:top w:w="100" w:type="dxa"/>
               <w:left w:w="120" w:type="dxa"/>
@@ -4754,7 +4830,7 @@
         <w:tc>
           <w:tcPr>
             <w:tcW w:w="3638" w:type="dxa"/>
-            <w:shd w:val="clear" w:color="auto" w:fill="4C2E71"/>
+            <w:shd w:val="clear" w:color="auto" w:fill="51389D"/>
             <w:tcMar>
               <w:top w:w="100" w:type="dxa"/>
               <w:left w:w="120" w:type="dxa"/>
@@ -4779,7 +4855,7 @@
         <w:tc>
           <w:tcPr>
             <w:tcW w:w="4042" w:type="dxa"/>
-            <w:shd w:val="clear" w:color="auto" w:fill="4C2E71"/>
+            <w:shd w:val="clear" w:color="auto" w:fill="51389D"/>
             <w:tcMar>
               <w:top w:w="100" w:type="dxa"/>
               <w:left w:w="120" w:type="dxa"/>
@@ -4806,7 +4882,7 @@
         <w:tc>
           <w:tcPr>
             <w:tcW w:w="2426" w:type="dxa"/>
-            <w:shd w:val="clear" w:color="auto" w:fill="FFFFFF" w:themeFill="background1"/>
+            <w:shd w:val="clear" w:color="auto" w:fill="F2EFFE" w:themeFill="background1"/>
             <w:tcMar>
               <w:top w:w="100" w:type="dxa"/>
               <w:left w:w="120" w:type="dxa"/>
@@ -4824,6 +4900,8 @@
             </w:pPr>
             <w:r>
               <w:rPr>
+                <w:b/>
+                <w:bCs/>
                 <w:sz w:val="18"/>
                 <w:szCs w:val="18"/>
               </w:rPr>
@@ -4836,7 +4914,7 @@
         <w:tc>
           <w:tcPr>
             <w:tcW w:w="3638" w:type="dxa"/>
-            <w:shd w:val="clear" w:color="auto" w:fill="EFF4FC"/>
+            <w:shd w:val="clear" w:color="auto" w:fill="FFFFFF"/>
             <w:tcMar>
               <w:top w:w="100" w:type="dxa"/>
               <w:left w:w="120" w:type="dxa"/>
@@ -4894,18 +4972,20 @@
         <w:tc>
           <w:tcPr>
             <w:tcW w:w="2426" w:type="dxa"/>
-            <w:shd w:val="clear" w:color="auto" w:fill="FFFFFF" w:themeFill="background1"/>
-            <w:tcMar>
-              <w:top w:w="100" w:type="dxa"/>
-              <w:left w:w="120" w:type="dxa"/>
-              <w:bottom w:w="100" w:type="dxa"/>
-              <w:right w:w="120" w:type="dxa"/>
-            </w:tcMar>
-            <w:vAlign w:val="center"/>
-          </w:tcPr>
-          <w:p>
-            <w:r>
-              <w:rPr>
+            <w:shd w:val="clear" w:color="auto" w:fill="F2EFFE" w:themeFill="background1"/>
+            <w:tcMar>
+              <w:top w:w="100" w:type="dxa"/>
+              <w:left w:w="120" w:type="dxa"/>
+              <w:bottom w:w="100" w:type="dxa"/>
+              <w:right w:w="120" w:type="dxa"/>
+            </w:tcMar>
+            <w:vAlign w:val="center"/>
+          </w:tcPr>
+          <w:p>
+            <w:r>
+              <w:rPr>
+                <w:b/>
+                <w:bCs/>
                 <w:sz w:val="18"/>
                 <w:szCs w:val="18"/>
               </w:rPr>
@@ -4916,7 +4996,7 @@
         <w:tc>
           <w:tcPr>
             <w:tcW w:w="3638" w:type="dxa"/>
-            <w:shd w:val="clear" w:color="auto" w:fill="EFF4FC"/>
+            <w:shd w:val="clear" w:color="auto" w:fill="FFFFFF"/>
             <w:tcMar>
               <w:top w:w="100" w:type="dxa"/>
               <w:left w:w="120" w:type="dxa"/>
@@ -4962,7 +5042,7 @@
         <w:tc>
           <w:tcPr>
             <w:tcW w:w="2426" w:type="dxa"/>
-            <w:shd w:val="clear" w:color="auto" w:fill="FFFFFF" w:themeFill="background1"/>
+            <w:shd w:val="clear" w:color="auto" w:fill="F2EFFE" w:themeFill="background1"/>
             <w:tcMar>
               <w:top w:w="100" w:type="dxa"/>
               <w:left w:w="120" w:type="dxa"/>
@@ -4980,6 +5060,8 @@
             </w:pPr>
             <w:r>
               <w:rPr>
+                <w:b/>
+                <w:bCs/>
                 <w:sz w:val="18"/>
                 <w:szCs w:val="18"/>
               </w:rPr>
@@ -4990,7 +5072,7 @@
         <w:tc>
           <w:tcPr>
             <w:tcW w:w="3638" w:type="dxa"/>
-            <w:shd w:val="clear" w:color="auto" w:fill="EFF4FC"/>
+            <w:shd w:val="clear" w:color="auto" w:fill="FFFFFF"/>
             <w:tcMar>
               <w:top w:w="100" w:type="dxa"/>
               <w:left w:w="120" w:type="dxa"/>
@@ -5060,18 +5142,20 @@
         <w:tc>
           <w:tcPr>
             <w:tcW w:w="2426" w:type="dxa"/>
-            <w:shd w:val="clear" w:color="auto" w:fill="FFFFFF" w:themeFill="background1"/>
-            <w:tcMar>
-              <w:top w:w="100" w:type="dxa"/>
-              <w:left w:w="120" w:type="dxa"/>
-              <w:bottom w:w="100" w:type="dxa"/>
-              <w:right w:w="120" w:type="dxa"/>
-            </w:tcMar>
-            <w:vAlign w:val="center"/>
-          </w:tcPr>
-          <w:p>
-            <w:r>
-              <w:rPr>
+            <w:shd w:val="clear" w:color="auto" w:fill="F2EFFE" w:themeFill="background1"/>
+            <w:tcMar>
+              <w:top w:w="100" w:type="dxa"/>
+              <w:left w:w="120" w:type="dxa"/>
+              <w:bottom w:w="100" w:type="dxa"/>
+              <w:right w:w="120" w:type="dxa"/>
+            </w:tcMar>
+            <w:vAlign w:val="center"/>
+          </w:tcPr>
+          <w:p>
+            <w:r>
+              <w:rPr>
+                <w:b/>
+                <w:bCs/>
                 <w:sz w:val="18"/>
                 <w:szCs w:val="18"/>
               </w:rPr>
@@ -5082,7 +5166,7 @@
         <w:tc>
           <w:tcPr>
             <w:tcW w:w="3638" w:type="dxa"/>
-            <w:shd w:val="clear" w:color="auto" w:fill="EFF4FC"/>
+            <w:shd w:val="clear" w:color="auto" w:fill="FFFFFF"/>
             <w:tcMar>
               <w:top w:w="100" w:type="dxa"/>
               <w:left w:w="120" w:type="dxa"/>
@@ -5128,18 +5212,20 @@
         <w:tc>
           <w:tcPr>
             <w:tcW w:w="2426" w:type="dxa"/>
-            <w:shd w:val="clear" w:color="auto" w:fill="FFFFFF" w:themeFill="background1"/>
-            <w:tcMar>
-              <w:top w:w="100" w:type="dxa"/>
-              <w:left w:w="120" w:type="dxa"/>
-              <w:bottom w:w="100" w:type="dxa"/>
-              <w:right w:w="120" w:type="dxa"/>
-            </w:tcMar>
-            <w:vAlign w:val="center"/>
-          </w:tcPr>
-          <w:p>
-            <w:r>
-              <w:rPr>
+            <w:shd w:val="clear" w:color="auto" w:fill="F2EFFE" w:themeFill="background1"/>
+            <w:tcMar>
+              <w:top w:w="100" w:type="dxa"/>
+              <w:left w:w="120" w:type="dxa"/>
+              <w:bottom w:w="100" w:type="dxa"/>
+              <w:right w:w="120" w:type="dxa"/>
+            </w:tcMar>
+            <w:vAlign w:val="center"/>
+          </w:tcPr>
+          <w:p>
+            <w:r>
+              <w:rPr>
+                <w:b/>
+                <w:bCs/>
                 <w:sz w:val="18"/>
                 <w:szCs w:val="18"/>
               </w:rPr>
@@ -5150,7 +5236,7 @@
         <w:tc>
           <w:tcPr>
             <w:tcW w:w="3638" w:type="dxa"/>
-            <w:shd w:val="clear" w:color="auto" w:fill="EFF4FC"/>
+            <w:shd w:val="clear" w:color="auto" w:fill="FFFFFF"/>
             <w:tcMar>
               <w:top w:w="100" w:type="dxa"/>
               <w:left w:w="120" w:type="dxa"/>
@@ -5196,18 +5282,20 @@
         <w:tc>
           <w:tcPr>
             <w:tcW w:w="2426" w:type="dxa"/>
-            <w:shd w:val="clear" w:color="auto" w:fill="FFFFFF" w:themeFill="background1"/>
-            <w:tcMar>
-              <w:top w:w="100" w:type="dxa"/>
-              <w:left w:w="120" w:type="dxa"/>
-              <w:bottom w:w="100" w:type="dxa"/>
-              <w:right w:w="120" w:type="dxa"/>
-            </w:tcMar>
-            <w:vAlign w:val="center"/>
-          </w:tcPr>
-          <w:p>
-            <w:r>
-              <w:rPr>
+            <w:shd w:val="clear" w:color="auto" w:fill="F2EFFE" w:themeFill="background1"/>
+            <w:tcMar>
+              <w:top w:w="100" w:type="dxa"/>
+              <w:left w:w="120" w:type="dxa"/>
+              <w:bottom w:w="100" w:type="dxa"/>
+              <w:right w:w="120" w:type="dxa"/>
+            </w:tcMar>
+            <w:vAlign w:val="center"/>
+          </w:tcPr>
+          <w:p>
+            <w:r>
+              <w:rPr>
+                <w:b/>
+                <w:bCs/>
                 <w:sz w:val="18"/>
                 <w:szCs w:val="18"/>
               </w:rPr>
@@ -5218,7 +5306,7 @@
         <w:tc>
           <w:tcPr>
             <w:tcW w:w="3638" w:type="dxa"/>
-            <w:shd w:val="clear" w:color="auto" w:fill="EFF4FC"/>
+            <w:shd w:val="clear" w:color="auto" w:fill="FFFFFF"/>
             <w:tcMar>
               <w:top w:w="100" w:type="dxa"/>
               <w:left w:w="120" w:type="dxa"/>
@@ -5264,18 +5352,20 @@
         <w:tc>
           <w:tcPr>
             <w:tcW w:w="2426" w:type="dxa"/>
-            <w:shd w:val="clear" w:color="auto" w:fill="FFFFFF" w:themeFill="background1"/>
-            <w:tcMar>
-              <w:top w:w="100" w:type="dxa"/>
-              <w:left w:w="120" w:type="dxa"/>
-              <w:bottom w:w="100" w:type="dxa"/>
-              <w:right w:w="120" w:type="dxa"/>
-            </w:tcMar>
-            <w:vAlign w:val="center"/>
-          </w:tcPr>
-          <w:p>
-            <w:r>
-              <w:rPr>
+            <w:shd w:val="clear" w:color="auto" w:fill="F2EFFE" w:themeFill="background1"/>
+            <w:tcMar>
+              <w:top w:w="100" w:type="dxa"/>
+              <w:left w:w="120" w:type="dxa"/>
+              <w:bottom w:w="100" w:type="dxa"/>
+              <w:right w:w="120" w:type="dxa"/>
+            </w:tcMar>
+            <w:vAlign w:val="center"/>
+          </w:tcPr>
+          <w:p>
+            <w:r>
+              <w:rPr>
+                <w:b/>
+                <w:bCs/>
                 <w:sz w:val="18"/>
                 <w:szCs w:val="18"/>
               </w:rPr>
@@ -5286,7 +5376,7 @@
         <w:tc>
           <w:tcPr>
             <w:tcW w:w="3638" w:type="dxa"/>
-            <w:shd w:val="clear" w:color="auto" w:fill="EFF4FC"/>
+            <w:shd w:val="clear" w:color="auto" w:fill="FFFFFF"/>
             <w:tcMar>
               <w:top w:w="100" w:type="dxa"/>
               <w:left w:w="120" w:type="dxa"/>
@@ -5332,18 +5422,20 @@
         <w:tc>
           <w:tcPr>
             <w:tcW w:w="2426" w:type="dxa"/>
-            <w:shd w:val="clear" w:color="auto" w:fill="FFFFFF" w:themeFill="background1"/>
-            <w:tcMar>
-              <w:top w:w="100" w:type="dxa"/>
-              <w:left w:w="120" w:type="dxa"/>
-              <w:bottom w:w="100" w:type="dxa"/>
-              <w:right w:w="120" w:type="dxa"/>
-            </w:tcMar>
-            <w:vAlign w:val="center"/>
-          </w:tcPr>
-          <w:p>
-            <w:r>
-              <w:rPr>
+            <w:shd w:val="clear" w:color="auto" w:fill="F2EFFE" w:themeFill="background1"/>
+            <w:tcMar>
+              <w:top w:w="100" w:type="dxa"/>
+              <w:left w:w="120" w:type="dxa"/>
+              <w:bottom w:w="100" w:type="dxa"/>
+              <w:right w:w="120" w:type="dxa"/>
+            </w:tcMar>
+            <w:vAlign w:val="center"/>
+          </w:tcPr>
+          <w:p>
+            <w:r>
+              <w:rPr>
+                <w:b/>
+                <w:bCs/>
                 <w:sz w:val="18"/>
                 <w:szCs w:val="18"/>
               </w:rPr>
@@ -5354,7 +5446,7 @@
         <w:tc>
           <w:tcPr>
             <w:tcW w:w="3638" w:type="dxa"/>
-            <w:shd w:val="clear" w:color="auto" w:fill="EFF4FC"/>
+            <w:shd w:val="clear" w:color="auto" w:fill="FFFFFF"/>
             <w:tcMar>
               <w:top w:w="100" w:type="dxa"/>
               <w:left w:w="120" w:type="dxa"/>
@@ -6354,9 +6446,11 @@
       <w:outlineLvl w:val="0"/>
     </w:pPr>
     <w:rPr>
-      <w:color w:val="2E74B5"/>
-      <w:sz w:val="32"/>
-      <w:szCs w:val="32"/>
+      <w:b/>
+      <w:bCs/>
+      <w:color w:val="51389D"/>
+      <w:sz w:val="40"/>
+      <w:szCs w:val="40"/>
     </w:rPr>
   </w:style>
   <w:style w:type="paragraph" w:styleId="Heading2">
@@ -6368,9 +6462,11 @@
       <w:outlineLvl w:val="1"/>
     </w:pPr>
     <w:rPr>
-      <w:color w:val="2E74B5"/>
-      <w:sz w:val="26"/>
-      <w:szCs w:val="26"/>
+      <w:b/>
+      <w:bCs/>
+      <w:color w:val="374050"/>
+      <w:sz w:val="32"/>
+      <w:szCs w:val="32"/>
     </w:rPr>
   </w:style>
   <w:style w:type="paragraph" w:styleId="Heading3">
@@ -6383,9 +6479,11 @@
       <w:outlineLvl w:val="2"/>
     </w:pPr>
     <w:rPr>
-      <w:color w:val="1F4D78"/>
-      <w:sz w:val="24"/>
-      <w:szCs w:val="24"/>
+      <w:b/>
+      <w:bCs/>
+      <w:color w:val="374050"/>
+      <w:sz w:val="28"/>
+      <w:szCs w:val="28"/>
     </w:rPr>
   </w:style>
   <w:style w:type="paragraph" w:styleId="Heading4">
@@ -6398,9 +6496,11 @@
       <w:outlineLvl w:val="3"/>
     </w:pPr>
     <w:rPr>
-      <w:i/>
-      <w:iCs/>
-      <w:color w:val="2E74B5"/>
+      <w:b/>
+      <w:bCs/>
+      <w:color w:val="374050"/>
+      <w:sz w:val="24"/>
+      <w:szCs w:val="24"/>
     </w:rPr>
   </w:style>
   <w:style w:type="paragraph" w:styleId="Heading5">
@@ -6413,7 +6513,11 @@
       <w:outlineLvl w:val="4"/>
     </w:pPr>
     <w:rPr>
-      <w:color w:val="2E74B5"/>
+      <w:b/>
+      <w:bCs/>
+      <w:color w:val="374050"/>
+      <w:sz w:val="24"/>
+      <w:szCs w:val="24"/>
     </w:rPr>
   </w:style>
   <w:style w:type="paragraph" w:styleId="Heading6">
@@ -6426,7 +6530,11 @@
       <w:outlineLvl w:val="5"/>
     </w:pPr>
     <w:rPr>
-      <w:color w:val="1F4D78"/>
+      <w:b/>
+      <w:bCs/>
+      <w:color w:val="374050"/>
+      <w:sz w:val="24"/>
+      <w:szCs w:val="24"/>
     </w:rPr>
   </w:style>
   <w:style w:type="character" w:default="1" w:styleId="DefaultParagraphFont">

</xml_diff>